<commit_message>
Correct pathway files and bibliography; rebuild deliverables
- Each research/pathway_*.md now opens with an October 2026 evidence
  review box; body corrections marked [Oct 2026]: Mitchell 2021
  attributions restated to what the paper found, overlap and 20-40%
  claims withdrawn, Chincoteague and seven-town list removed, Cape
  Charles sewered, Leight & Hood citation fixed, 18-inch separation
  rule, Speiran/Stanhope described as agricultural-nitrate studies,
  evidence labels downgraded, misattributed citations fixed or
  flagged as unverified.
- ECOLOGICAL_BIBLIOGRAPHY.md: AI-assistance/verification header,
  verified corrections, constructed Chincoteague entry struck.
- Pathway 4 points to the synthesis summary of actual VDH monitoring.
- Deliverables rebuilt: memo added, superseded articles dropped from
  the package; --check passes.

Co-Authored-By: Claude Opus 5.5 <noreply@anthropic.com>
Claude-Session: https://claude.ai/code/session_012YCedtnz98mNBUx63G67me
</commit_message>
<xml_diff>
--- a/deliverables/ECOLOGICAL_RESEARCH_STRATEGY.docx
+++ b/deliverables/ECOLOGICAL_RESEARCH_STRATEGY.docx
@@ -2,7 +2,7 @@
 <file path=word/document.xml><?xml version="1.0" encoding="utf-8"?>
 <w:document xmlns:w="http://schemas.openxmlformats.org/wordprocessingml/2006/main" xmlns:m="http://schemas.openxmlformats.org/officeDocument/2006/math" xmlns:r="http://schemas.openxmlformats.org/officeDocument/2006/relationships" xmlns:o="urn:schemas-microsoft-com:office:office" xmlns:v="urn:schemas-microsoft-com:vml" xmlns:w10="urn:schemas-microsoft-com:office:word" xmlns:a="http://schemas.openxmlformats.org/drawingml/2006/main" xmlns:pic="http://schemas.openxmlformats.org/drawingml/2006/picture" xmlns:wp="http://schemas.openxmlformats.org/drawingml/2006/wordprocessingDrawing">
   <w:body>
-    <w:bookmarkStart w:id="40" w:name="X04732f0b952e9e7385d685a53aeffd21d88a38b"/>
+    <w:bookmarkStart w:id="29" w:name="X04732f0b952e9e7385d685a53aeffd21d88a38b"/>
     <w:p>
       <w:pPr>
         <w:pStyle w:val="Heading1"/>
@@ -17,8 +17,8 @@
       </w:pPr>
       <w:r>
         <w:rPr>
-          <w:bCs/>
-          <w:b/>
+          <w:b/>
+          <w:bCs/>
         </w:rPr>
         <w:t xml:space="preserve">Project:</w:t>
       </w:r>
@@ -32,13 +32,7 @@
         <w:t xml:space="preserve"> </w:t>
       </w:r>
       <w:r>
-        <w:t xml:space="preserve">“</w:t>
-      </w:r>
-      <w:r>
-        <w:t xml:space="preserve">Co-Producing Equitable Solutions to Septic System Failures: Towards a Regional Resilience Hub</w:t>
-      </w:r>
-      <w:r>
-        <w:t xml:space="preserve">”</w:t>
+        <w:t xml:space="preserve">“Co-Producing Equitable Solutions to Septic System Failures: Towards a Regional Resilience Hub”</w:t>
       </w:r>
       <w:r>
         <w:t xml:space="preserve"> </w:t>
@@ -51,8 +45,8 @@
       </w:r>
       <w:r>
         <w:rPr>
-          <w:bCs/>
-          <w:b/>
+          <w:b/>
+          <w:bCs/>
         </w:rPr>
         <w:t xml:space="preserve">Author of this strategy:</w:t>
       </w:r>
@@ -67,8 +61,8 @@
       </w:r>
       <w:r>
         <w:rPr>
-          <w:bCs/>
-          <w:b/>
+          <w:b/>
+          <w:bCs/>
         </w:rPr>
         <w:t xml:space="preserve">Status:</w:t>
       </w:r>
@@ -78,13 +72,64 @@
       <w:r>
         <w:t xml:space="preserve">Scoping document. Approved by Alex 2026-04-14.</w:t>
       </w:r>
-      <w:r>
-        <w:t xml:space="preserve"> </w:t>
-      </w:r>
-      <w:r>
-        <w:rPr>
-          <w:bCs/>
-          <w:b/>
+    </w:p>
+    <w:p>
+      <w:pPr>
+        <w:pStyle w:val="BlockText"/>
+      </w:pPr>
+      <w:r>
+        <w:rPr>
+          <w:b/>
+          <w:bCs/>
+        </w:rPr>
+        <w:t xml:space="preserve">October 2026 update.</w:t>
+      </w:r>
+      <w:r>
+        <w:t xml:space="preserve"> </w:t>
+      </w:r>
+      <w:r>
+        <w:t xml:space="preserve">The synthesis this strategy produced has been audited and corrected; see the evidence-review box at the top of</w:t>
+      </w:r>
+      <w:r>
+        <w:t xml:space="preserve"> </w:t>
+      </w:r>
+      <w:r>
+        <w:rPr>
+          <w:rStyle w:val="VerbatimChar"/>
+        </w:rPr>
+        <w:t xml:space="preserve">ECOLOGICAL_EFFECTS_SYNTHESIS.md</w:t>
+      </w:r>
+      <w:r>
+        <w:t xml:space="preserve">. The audit found no published Eastern Shore–specific evidence of current septic-caused ecological harm. The Phase 4</w:t>
+      </w:r>
+      <w:r>
+        <w:t xml:space="preserve"> </w:t>
+      </w:r>
+      <w:r>
+        <w:t xml:space="preserve">“6% vs. 3.3%”</w:t>
+      </w:r>
+      <w:r>
+        <w:t xml:space="preserve"> </w:t>
+      </w:r>
+      <w:r>
+        <w:t xml:space="preserve">resolution is retained, but the synthesis’s additional claim that the local ESVA share is 20–40% has been withdrawn as unsourced. Public outreach now leads with household finances, health (well testing) and legal compliance rather than ecology (</w:t>
+      </w:r>
+      <w:r>
+        <w:rPr>
+          <w:rStyle w:val="VerbatimChar"/>
+        </w:rPr>
+        <w:t xml:space="preserve">OUTREACH_MESSAGING_REVIEW.md</w:t>
+      </w:r>
+      <w:r>
+        <w:t xml:space="preserve">). The ecological questions remain open, answerable research questions, and are the natural core of the Phase 5 data-gap and capstone work: source attribution, an overlay of closure areas against septic density, and groundwater monitoring around septic clusters.</w:t>
+      </w:r>
+      <w:r>
+        <w:t xml:space="preserve"> </w:t>
+      </w:r>
+      <w:r>
+        <w:rPr>
+          <w:b/>
+          <w:bCs/>
         </w:rPr>
         <w:t xml:space="preserve">Purpose:</w:t>
       </w:r>
@@ -99,8 +144,8 @@
       </w:r>
       <w:r>
         <w:rPr>
-          <w:bCs/>
-          <w:b/>
+          <w:b/>
+          <w:bCs/>
         </w:rPr>
         <w:t xml:space="preserve">ecological</w:t>
       </w:r>
@@ -118,7 +163,7 @@
         </w:pict>
       </w:r>
     </w:p>
-    <w:bookmarkStart w:id="23" w:name="scope-and-boundaries"/>
+    <w:bookmarkStart w:id="12" w:name="scope-and-boundaries"/>
     <w:p>
       <w:pPr>
         <w:pStyle w:val="Heading2"/>
@@ -127,7 +172,7 @@
         <w:t xml:space="preserve">1. Scope and boundaries</w:t>
       </w:r>
     </w:p>
-    <w:bookmarkStart w:id="20" w:name="what-this-research-covers"/>
+    <w:bookmarkStart w:id="9" w:name="what-this-research-covers"/>
     <w:p>
       <w:pPr>
         <w:pStyle w:val="Heading3"/>
@@ -144,8 +189,8 @@
         <w:t xml:space="preserve">A scholarly evidence synthesis of the ecological (non-human-health) effects of failing decentralized septic systems, anchored to ESVA conditions, with analogue-region evidence pulled in where ESVA-specific data is thin. The goal is to uncover the most likely and best-supported ecological effects of septic dysfunction on ESVA, and to make the evidence base explicit, cited, and updatable.</w:t>
       </w:r>
     </w:p>
-    <w:bookmarkEnd w:id="20"/>
-    <w:bookmarkStart w:id="21" w:name="what-this-research-does-not-cover"/>
+    <w:bookmarkEnd w:id="9"/>
+    <w:bookmarkStart w:id="10" w:name="what-this-research-does-not-cover"/>
     <w:p>
       <w:pPr>
         <w:pStyle w:val="Heading3"/>
@@ -210,8 +255,8 @@
         <w:t xml:space="preserve">). This synthesis will cross-reference those documents but will not re-litigate them.</w:t>
       </w:r>
     </w:p>
-    <w:bookmarkEnd w:id="21"/>
-    <w:bookmarkStart w:id="22" w:name="output-tone"/>
+    <w:bookmarkEnd w:id="10"/>
+    <w:bookmarkStart w:id="11" w:name="output-tone"/>
     <w:p>
       <w:pPr>
         <w:pStyle w:val="Heading3"/>
@@ -226,8 +271,8 @@
       </w:pPr>
       <w:r>
         <w:rPr>
-          <w:bCs/>
-          <w:b/>
+          <w:b/>
+          <w:bCs/>
         </w:rPr>
         <w:t xml:space="preserve">Scholarly.</w:t>
       </w:r>
@@ -245,9 +290,9 @@
         </w:pict>
       </w:r>
     </w:p>
-    <w:bookmarkEnd w:id="22"/>
-    <w:bookmarkEnd w:id="23"/>
-    <w:bookmarkStart w:id="31" w:name="framework-six-ecological-pathways"/>
+    <w:bookmarkEnd w:id="11"/>
+    <w:bookmarkEnd w:id="12"/>
+    <w:bookmarkStart w:id="20" w:name="framework-six-ecological-pathways"/>
     <w:p>
       <w:pPr>
         <w:pStyle w:val="Heading2"/>
@@ -264,7 +309,7 @@
         <w:t xml:space="preserve">The synthesis is organized around six distinct ecological endpoints. Each pathway is treated independently but cross-linked where mechanisms overlap. The six were chosen to cover (a) the proximate subsurface pathway, (b) the tidal creek pathway that dominates ESVA hydrography, (c) the two hydrologically distinct receiving-water systems (Chesapeake Bay vs. Seaside lagoons), (d) the shellfish grounds that tie ecology to economy, (e) iconic/sensitive species for later outreach leverage, and (f) the terrestrial drainfield footprint that is often overlooked.</w:t>
       </w:r>
     </w:p>
-    <w:bookmarkStart w:id="24" w:name="Xb644b2723dded56267f5bd6b96f6b1cfac08c1a"/>
+    <w:bookmarkStart w:id="13" w:name="Xb644b2723dded56267f5bd6b96f6b1cfac08c1a"/>
     <w:p>
       <w:pPr>
         <w:pStyle w:val="Heading3"/>
@@ -281,8 +326,8 @@
         <w:t xml:space="preserve">Subsurface nitrate and phosphorus plumes; pharmaceutical/personal-care-product persistence; shifts in subsurface microbial communities; coupled effects with saltwater intrusion and sea-level rise. The aquifer is both a habitat and the proximate receiving environment for every septic drainfield on ESVA, and it feeds most of the surface-water pathways downstream.</w:t>
       </w:r>
     </w:p>
-    <w:bookmarkEnd w:id="24"/>
-    <w:bookmarkStart w:id="25" w:name="Xd90501ec8871bb6b085b364eb533d797350bd60"/>
+    <w:bookmarkEnd w:id="13"/>
+    <w:bookmarkStart w:id="14" w:name="Xd90501ec8871bb6b085b364eb533d797350bd60"/>
     <w:p>
       <w:pPr>
         <w:pStyle w:val="Heading3"/>
@@ -299,8 +344,8 @@
         <w:t xml:space="preserve">ESVA is bisected and drained by an unusually dense network of short tidal creeks, many of which intersect shallow aquifers and directly receive septic-derived nutrients. Focus: N and P loading, DIN:DIP ratio shifts, marsh vegetation response, denitrification capacity limits, macrofauna effects.</w:t>
       </w:r>
     </w:p>
-    <w:bookmarkEnd w:id="25"/>
-    <w:bookmarkStart w:id="26" w:name="pathway-3-receiving-waters"/>
+    <w:bookmarkEnd w:id="14"/>
+    <w:bookmarkStart w:id="15" w:name="pathway-3-receiving-waters"/>
     <w:p>
       <w:pPr>
         <w:pStyle w:val="Heading3"/>
@@ -321,8 +366,8 @@
       </w:r>
       <w:r>
         <w:rPr>
-          <w:bCs/>
-          <w:b/>
+          <w:b/>
+          <w:bCs/>
         </w:rPr>
         <w:t xml:space="preserve">two linked but distinct systems</w:t>
       </w:r>
@@ -340,8 +385,8 @@
       </w:r>
       <w:r>
         <w:rPr>
-          <w:bCs/>
-          <w:b/>
+          <w:b/>
+          <w:bCs/>
         </w:rPr>
         <w:t xml:space="preserve">Pathway 3a — Chesapeake Bay mainstem and western Shore tributaries</w:t>
       </w:r>
@@ -362,8 +407,8 @@
       </w:r>
       <w:r>
         <w:rPr>
-          <w:bCs/>
-          <w:b/>
+          <w:b/>
+          <w:bCs/>
         </w:rPr>
         <w:t xml:space="preserve">Pathway 3b — Seaside coastal lagoons</w:t>
       </w:r>
@@ -375,8 +420,8 @@
       </w:r>
       <w:r>
         <w:rPr>
+          <w:i/>
           <w:iCs/>
-          <w:i/>
         </w:rPr>
         <w:t xml:space="preserve">Zostera marina</w:t>
       </w:r>
@@ -392,8 +437,8 @@
         <w:t xml:space="preserve">Synthesized where the mechanism is identical (e.g., nitrate → chlorophyll-a response); separated where the hydrology, biota, or management context diverges materially.</w:t>
       </w:r>
     </w:p>
-    <w:bookmarkEnd w:id="26"/>
-    <w:bookmarkStart w:id="27" w:name="Xf89589fc54c3b7192a2bbdfde211729ab22e1e0"/>
+    <w:bookmarkEnd w:id="15"/>
+    <w:bookmarkStart w:id="16" w:name="Xf89589fc54c3b7192a2bbdfde211729ab22e1e0"/>
     <w:p>
       <w:pPr>
         <w:pStyle w:val="Heading3"/>
@@ -410,8 +455,8 @@
         <w:t xml:space="preserve">Fecal coliform and norovirus closures, nitrogen effects on SAV-dependent bay scallop and blue crab nursery habitat, hard clam and oyster aquaculture exposure, economic-ecological coupling. This pathway is where ecological damage has the most direct documented dollar value, which makes it useful for both scientific and eventual policy framings.</w:t>
       </w:r>
     </w:p>
-    <w:bookmarkEnd w:id="27"/>
-    <w:bookmarkStart w:id="28" w:name="Xf31b252508fbfae65fc2863eedac4e4a1cf2ac0"/>
+    <w:bookmarkEnd w:id="16"/>
+    <w:bookmarkStart w:id="17" w:name="Xf31b252508fbfae65fc2863eedac4e4a1cf2ac0"/>
     <w:p>
       <w:pPr>
         <w:pStyle w:val="Heading3"/>
@@ -464,8 +509,8 @@
         <w:t xml:space="preserve">- SAV as habitat-forming species in its own right (cross-referenced to Pathway 3)</w:t>
       </w:r>
     </w:p>
-    <w:bookmarkEnd w:id="28"/>
-    <w:bookmarkStart w:id="29" w:name="X6228f5b0d0dd2e59c1fb270ffe6ce24ba4dcd65"/>
+    <w:bookmarkEnd w:id="17"/>
+    <w:bookmarkStart w:id="18" w:name="X6228f5b0d0dd2e59c1fb270ffe6ce24ba4dcd65"/>
     <w:p>
       <w:pPr>
         <w:pStyle w:val="Heading3"/>
@@ -482,8 +527,8 @@
         <w:t xml:space="preserve">The drainfield itself is a localized ecosystem. Soil saturation effects on nearby trees and vegetation, facilitation of invasive plants, shifts in soil denitrification capacity when the water table rises, mosquito habitat creation, and surface ponding effects on adjacent wetlands. A small section relative to the others but important because it is frequently elided in septic-failure literature.</w:t>
       </w:r>
     </w:p>
-    <w:bookmarkEnd w:id="29"/>
-    <w:bookmarkStart w:id="30" w:name="pathway-structure-within-each-section"/>
+    <w:bookmarkEnd w:id="18"/>
+    <w:bookmarkStart w:id="19" w:name="pathway-structure-within-each-section"/>
     <w:p>
       <w:pPr>
         <w:pStyle w:val="Heading3"/>
@@ -549,9 +594,9 @@
         </w:pict>
       </w:r>
     </w:p>
-    <w:bookmarkEnd w:id="30"/>
-    <w:bookmarkEnd w:id="31"/>
-    <w:bookmarkStart w:id="35" w:name="data-sources"/>
+    <w:bookmarkEnd w:id="19"/>
+    <w:bookmarkEnd w:id="20"/>
+    <w:bookmarkStart w:id="24" w:name="data-sources"/>
     <w:p>
       <w:pPr>
         <w:pStyle w:val="Heading2"/>
@@ -560,7 +605,7 @@
         <w:t xml:space="preserve">3. Data sources</w:t>
       </w:r>
     </w:p>
-    <w:bookmarkStart w:id="33" w:name="X0626dedb2712b149ca5e7c803c2cede5fd7e220"/>
+    <w:bookmarkStart w:id="22" w:name="X0626dedb2712b149ca5e7c803c2cede5fd7e220"/>
     <w:p>
       <w:pPr>
         <w:pStyle w:val="Heading3"/>
@@ -571,16 +616,16 @@
     </w:p>
     <w:p>
       <w:pPr>
+        <w:pStyle w:val="Compact"/>
         <w:numPr>
           <w:ilvl w:val="0"/>
           <w:numId w:val="1001"/>
         </w:numPr>
-        <w:pStyle w:val="Compact"/>
-      </w:pPr>
-      <w:r>
-        <w:rPr>
-          <w:bCs/>
-          <w:b/>
+      </w:pPr>
+      <w:r>
+        <w:rPr>
+          <w:b/>
+          <w:bCs/>
         </w:rPr>
         <w:t xml:space="preserve">AdaptVA Wastewater Data Viewer</w:t>
       </w:r>
@@ -593,7 +638,7 @@
       <w:r>
         <w:t xml:space="preserve"> </w:t>
       </w:r>
-      <w:hyperlink r:id="rId32">
+      <w:hyperlink r:id="rId21">
         <w:r>
           <w:rPr>
             <w:rStyle w:val="Hyperlink"/>
@@ -604,438 +649,424 @@
     </w:p>
     <w:p>
       <w:pPr>
+        <w:pStyle w:val="Compact"/>
         <w:numPr>
           <w:ilvl w:val="0"/>
           <w:numId w:val="1001"/>
         </w:numPr>
+      </w:pPr>
+      <w:r>
+        <w:rPr>
+          <w:b/>
+          <w:bCs/>
+        </w:rPr>
+        <w:t xml:space="preserve">AdaptVA Rural Septic Assessment</w:t>
+      </w:r>
+      <w:r>
+        <w:t xml:space="preserve"> </w:t>
+      </w:r>
+      <w:r>
+        <w:t xml:space="preserve">— community septic suitability analysis.</w:t>
+      </w:r>
+    </w:p>
+    <w:p>
+      <w:pPr>
         <w:pStyle w:val="Compact"/>
-      </w:pPr>
-      <w:r>
-        <w:rPr>
-          <w:bCs/>
-          <w:b/>
-        </w:rPr>
-        <w:t xml:space="preserve">AdaptVA Rural Septic Assessment</w:t>
-      </w:r>
-      <w:r>
-        <w:t xml:space="preserve"> </w:t>
-      </w:r>
-      <w:r>
-        <w:t xml:space="preserve">— community septic suitability analysis.</w:t>
-      </w:r>
-    </w:p>
-    <w:p>
-      <w:pPr>
         <w:numPr>
           <w:ilvl w:val="0"/>
           <w:numId w:val="1001"/>
         </w:numPr>
+      </w:pPr>
+      <w:r>
+        <w:rPr>
+          <w:b/>
+          <w:bCs/>
+        </w:rPr>
+        <w:t xml:space="preserve">VDH Division of Shellfish Safety</w:t>
+      </w:r>
+      <w:r>
+        <w:t xml:space="preserve"> </w:t>
+      </w:r>
+      <w:r>
+        <w:t xml:space="preserve">— per-county condemnation documents, shoreline survey reports, and the Shellfish Harvesting Area Map. Accomack and Northampton have dedicated pages.</w:t>
+      </w:r>
+    </w:p>
+    <w:p>
+      <w:pPr>
         <w:pStyle w:val="Compact"/>
-      </w:pPr>
-      <w:r>
-        <w:rPr>
-          <w:bCs/>
-          <w:b/>
-        </w:rPr>
-        <w:t xml:space="preserve">VDH Division of Shellfish Safety</w:t>
-      </w:r>
-      <w:r>
-        <w:t xml:space="preserve"> </w:t>
-      </w:r>
-      <w:r>
-        <w:t xml:space="preserve">— per-county condemnation documents, shoreline survey reports, and the Shellfish Harvesting Area Map. Accomack and Northampton have dedicated pages.</w:t>
-      </w:r>
-    </w:p>
-    <w:p>
-      <w:pPr>
         <w:numPr>
           <w:ilvl w:val="0"/>
           <w:numId w:val="1001"/>
         </w:numPr>
+      </w:pPr>
+      <w:r>
+        <w:rPr>
+          <w:b/>
+          <w:bCs/>
+        </w:rPr>
+        <w:t xml:space="preserve">Virginia DEQ Chesapeake Bay Monitoring Program</w:t>
+      </w:r>
+      <w:r>
+        <w:t xml:space="preserve"> </w:t>
+      </w:r>
+      <w:r>
+        <w:t xml:space="preserve">— 27 mainstem stations including Pocomoke Sound; monthly (bi-monthly in summer) nutrient and DO data back decades.</w:t>
+      </w:r>
+    </w:p>
+    <w:p>
+      <w:pPr>
         <w:pStyle w:val="Compact"/>
-      </w:pPr>
-      <w:r>
-        <w:rPr>
-          <w:bCs/>
-          <w:b/>
-        </w:rPr>
-        <w:t xml:space="preserve">Virginia DEQ Chesapeake Bay Monitoring Program</w:t>
-      </w:r>
-      <w:r>
-        <w:t xml:space="preserve"> </w:t>
-      </w:r>
-      <w:r>
-        <w:t xml:space="preserve">— 27 mainstem stations including Pocomoke Sound; monthly (bi-monthly in summer) nutrient and DO data back decades.</w:t>
-      </w:r>
-    </w:p>
-    <w:p>
-      <w:pPr>
         <w:numPr>
           <w:ilvl w:val="0"/>
           <w:numId w:val="1001"/>
         </w:numPr>
+      </w:pPr>
+      <w:r>
+        <w:rPr>
+          <w:b/>
+          <w:bCs/>
+        </w:rPr>
+        <w:t xml:space="preserve">Virginia Environmental Data Hub</w:t>
+      </w:r>
+      <w:r>
+        <w:t xml:space="preserve"> </w:t>
+      </w:r>
+      <w:r>
+        <w:t xml:space="preserve">(DEQ ArcGIS) — 303(d) impaired waters, TMDLs, spatial water quality.</w:t>
+      </w:r>
+    </w:p>
+    <w:p>
+      <w:pPr>
         <w:pStyle w:val="Compact"/>
-      </w:pPr>
-      <w:r>
-        <w:rPr>
-          <w:bCs/>
-          <w:b/>
-        </w:rPr>
-        <w:t xml:space="preserve">Virginia Environmental Data Hub</w:t>
-      </w:r>
-      <w:r>
-        <w:t xml:space="preserve"> </w:t>
-      </w:r>
-      <w:r>
-        <w:t xml:space="preserve">(DEQ ArcGIS) — 303(d) impaired waters, TMDLs, spatial water quality.</w:t>
-      </w:r>
-    </w:p>
-    <w:p>
-      <w:pPr>
         <w:numPr>
           <w:ilvl w:val="0"/>
           <w:numId w:val="1001"/>
         </w:numPr>
+      </w:pPr>
+      <w:r>
+        <w:rPr>
+          <w:b/>
+          <w:bCs/>
+        </w:rPr>
+        <w:t xml:space="preserve">Chesapeake Bay Program CAST model</w:t>
+      </w:r>
+      <w:r>
+        <w:t xml:space="preserve"> </w:t>
+      </w:r>
+      <w:r>
+        <w:t xml:space="preserve">— sector-level nutrient load attribution by sub-basin. Used to resolve the 6% vs. 3.3% septic-nitrogen figure (see §5).</w:t>
+      </w:r>
+    </w:p>
+    <w:p>
+      <w:pPr>
         <w:pStyle w:val="Compact"/>
-      </w:pPr>
-      <w:r>
-        <w:rPr>
-          <w:bCs/>
-          <w:b/>
-        </w:rPr>
-        <w:t xml:space="preserve">Chesapeake Bay Program CAST model</w:t>
-      </w:r>
-      <w:r>
-        <w:t xml:space="preserve"> </w:t>
-      </w:r>
-      <w:r>
-        <w:t xml:space="preserve">— sector-level nutrient load attribution by sub-basin. Used to resolve the 6% vs. 3.3% septic-nitrogen figure (see §5).</w:t>
-      </w:r>
-    </w:p>
-    <w:p>
-      <w:pPr>
         <w:numPr>
           <w:ilvl w:val="0"/>
           <w:numId w:val="1001"/>
         </w:numPr>
+      </w:pPr>
+      <w:r>
+        <w:rPr>
+          <w:b/>
+          <w:bCs/>
+        </w:rPr>
+        <w:t xml:space="preserve">VIMS SAV Monitoring Program</w:t>
+      </w:r>
+      <w:r>
+        <w:t xml:space="preserve"> </w:t>
+      </w:r>
+      <w:r>
+        <w:t xml:space="preserve">— annual aerial SAV surveys for the Chesapeake Bay and seaside lagoons.</w:t>
+      </w:r>
+    </w:p>
+    <w:p>
+      <w:pPr>
         <w:pStyle w:val="Compact"/>
-      </w:pPr>
-      <w:r>
-        <w:rPr>
-          <w:bCs/>
-          <w:b/>
-        </w:rPr>
-        <w:t xml:space="preserve">VIMS SAV Monitoring Program</w:t>
-      </w:r>
-      <w:r>
-        <w:t xml:space="preserve"> </w:t>
-      </w:r>
-      <w:r>
-        <w:t xml:space="preserve">— annual aerial SAV surveys for the Chesapeake Bay and seaside lagoons.</w:t>
-      </w:r>
-    </w:p>
-    <w:p>
-      <w:pPr>
         <w:numPr>
           <w:ilvl w:val="0"/>
           <w:numId w:val="1001"/>
         </w:numPr>
+      </w:pPr>
+      <w:r>
+        <w:rPr>
+          <w:b/>
+          <w:bCs/>
+        </w:rPr>
+        <w:t xml:space="preserve">USGS National Water Information System</w:t>
+      </w:r>
+      <w:r>
+        <w:t xml:space="preserve"> </w:t>
+      </w:r>
+      <w:r>
+        <w:t xml:space="preserve">— well and surface-water nutrient data for the Columbia aquifer.</w:t>
+      </w:r>
+    </w:p>
+    <w:p>
+      <w:pPr>
         <w:pStyle w:val="Compact"/>
-      </w:pPr>
-      <w:r>
-        <w:rPr>
-          <w:bCs/>
-          <w:b/>
-        </w:rPr>
-        <w:t xml:space="preserve">USGS National Water Information System</w:t>
-      </w:r>
-      <w:r>
-        <w:t xml:space="preserve"> </w:t>
-      </w:r>
-      <w:r>
-        <w:t xml:space="preserve">— well and surface-water nutrient data for the Columbia aquifer.</w:t>
-      </w:r>
-    </w:p>
-    <w:p>
-      <w:pPr>
         <w:numPr>
           <w:ilvl w:val="0"/>
           <w:numId w:val="1001"/>
         </w:numPr>
+      </w:pPr>
+      <w:r>
+        <w:rPr>
+          <w:b/>
+          <w:bCs/>
+        </w:rPr>
+        <w:t xml:space="preserve">EPA ECHO</w:t>
+      </w:r>
+      <w:r>
+        <w:t xml:space="preserve"> </w:t>
+      </w:r>
+      <w:r>
+        <w:t xml:space="preserve">— NPDES permit violations for municipal wastewater plants on the Shore (for comparative baseline).</w:t>
+      </w:r>
+    </w:p>
+    <w:p>
+      <w:pPr>
         <w:pStyle w:val="Compact"/>
-      </w:pPr>
-      <w:r>
-        <w:rPr>
-          <w:bCs/>
-          <w:b/>
-        </w:rPr>
-        <w:t xml:space="preserve">EPA ECHO</w:t>
-      </w:r>
-      <w:r>
-        <w:t xml:space="preserve"> </w:t>
-      </w:r>
-      <w:r>
-        <w:t xml:space="preserve">— NPDES permit violations for municipal wastewater plants on the Shore (for comparative baseline).</w:t>
-      </w:r>
-    </w:p>
-    <w:p>
-      <w:pPr>
         <w:numPr>
           <w:ilvl w:val="0"/>
           <w:numId w:val="1001"/>
         </w:numPr>
+      </w:pPr>
+      <w:r>
+        <w:rPr>
+          <w:b/>
+          <w:bCs/>
+        </w:rPr>
+        <w:t xml:space="preserve">NOAA Chesapeake Bay Office, CBP STAC reports, EPA Region 3 publications</w:t>
+      </w:r>
+      <w:r>
+        <w:t xml:space="preserve"> </w:t>
+      </w:r>
+      <w:r>
+        <w:t xml:space="preserve">— gray literature on ecological status and trends.</w:t>
+      </w:r>
+    </w:p>
+    <w:p>
+      <w:pPr>
         <w:pStyle w:val="Compact"/>
-      </w:pPr>
-      <w:r>
-        <w:rPr>
-          <w:bCs/>
-          <w:b/>
-        </w:rPr>
-        <w:t xml:space="preserve">NOAA Chesapeake Bay Office, CBP STAC reports, EPA Region 3 publications</w:t>
-      </w:r>
-      <w:r>
-        <w:t xml:space="preserve"> </w:t>
-      </w:r>
-      <w:r>
-        <w:t xml:space="preserve">— gray literature on ecological status and trends.</w:t>
-      </w:r>
-    </w:p>
-    <w:p>
-      <w:pPr>
         <w:numPr>
           <w:ilvl w:val="0"/>
           <w:numId w:val="1001"/>
         </w:numPr>
+      </w:pPr>
+      <w:r>
+        <w:rPr>
+          <w:b/>
+          <w:bCs/>
+        </w:rPr>
+        <w:t xml:space="preserve">Peer-reviewed literature</w:t>
+      </w:r>
+      <w:r>
+        <w:t xml:space="preserve"> </w:t>
+      </w:r>
+      <w:r>
+        <w:t xml:space="preserve">via Google Scholar / Web of Science, chased forward from the citation list in the project’s</w:t>
+      </w:r>
+      <w:r>
+        <w:t xml:space="preserve"> </w:t>
+      </w:r>
+      <w:r>
+        <w:rPr>
+          <w:rStyle w:val="VerbatimChar"/>
+        </w:rPr>
+        <w:t xml:space="preserve">Narrative_Final</w:t>
+      </w:r>
+      <w:r>
+        <w:t xml:space="preserve"> </w:t>
+      </w:r>
+      <w:r>
+        <w:t xml:space="preserve">— especially Mitchell et al. 2021 (</w:t>
+      </w:r>
+      <w:r>
+        <w:rPr>
+          <w:i/>
+          <w:iCs/>
+        </w:rPr>
+        <w:t xml:space="preserve">Frontiers in Marine Science</w:t>
+      </w:r>
+      <w:r>
+        <w:t xml:space="preserve">), the CBSAG 2021 report, Hoghooghi et al. 2021, Cox/Loomis/Amador 2019, O’Driscoll et al. 2024.</w:t>
+      </w:r>
+    </w:p>
+    <w:bookmarkEnd w:id="22"/>
+    <w:bookmarkStart w:id="23" w:name="needs-alexs-help-to-obtain-flagged"/>
+    <w:p>
+      <w:pPr>
+        <w:pStyle w:val="Heading3"/>
+      </w:pPr>
+      <w:r>
+        <w:t xml:space="preserve">3.2 Needs Alex’s help to obtain — flagged</w:t>
+      </w:r>
+    </w:p>
+    <w:p>
+      <w:pPr>
         <w:pStyle w:val="Compact"/>
-      </w:pPr>
-      <w:r>
-        <w:rPr>
-          <w:bCs/>
-          <w:b/>
-        </w:rPr>
-        <w:t xml:space="preserve">Peer-reviewed literature</w:t>
-      </w:r>
-      <w:r>
-        <w:t xml:space="preserve"> </w:t>
-      </w:r>
-      <w:r>
-        <w:t xml:space="preserve">via Google Scholar / Web of Science, chased forward from the citation list in the project’s</w:t>
-      </w:r>
-      <w:r>
-        <w:t xml:space="preserve"> </w:t>
-      </w:r>
-      <w:r>
-        <w:rPr>
-          <w:rStyle w:val="VerbatimChar"/>
-        </w:rPr>
-        <w:t xml:space="preserve">Narrative_Final</w:t>
-      </w:r>
-      <w:r>
-        <w:t xml:space="preserve"> </w:t>
-      </w:r>
-      <w:r>
-        <w:t xml:space="preserve">— especially Mitchell et al. 2021 (</w:t>
-      </w:r>
-      <w:r>
-        <w:rPr>
-          <w:iCs/>
-          <w:i/>
-        </w:rPr>
-        <w:t xml:space="preserve">Frontiers in Marine Science</w:t>
-      </w:r>
-      <w:r>
-        <w:t xml:space="preserve">), the CBSAG 2021 report, Hoghooghi et al. 2021, Cox/Loomis/Amador 2019, O’Driscoll et al. 2024.</w:t>
-      </w:r>
-    </w:p>
-    <w:bookmarkEnd w:id="33"/>
-    <w:bookmarkStart w:id="34" w:name="needs-alexs-help-to-obtain-flagged"/>
-    <w:p>
-      <w:pPr>
-        <w:pStyle w:val="Heading3"/>
-      </w:pPr>
-      <w:r>
-        <w:t xml:space="preserve">3.2 Needs Alex’s help to obtain — flagged</w:t>
-      </w:r>
-    </w:p>
-    <w:p>
-      <w:pPr>
         <w:numPr>
           <w:ilvl w:val="0"/>
           <w:numId w:val="1002"/>
         </w:numPr>
+      </w:pPr>
+      <w:r>
+        <w:rPr>
+          <w:b/>
+          <w:bCs/>
+        </w:rPr>
+        <w:t xml:space="preserve">Jon Richardson’s VDH ESVA repair permit dataset with tax-map numbers</w:t>
+      </w:r>
+      <w:r>
+        <w:t xml:space="preserve"> </w:t>
+      </w:r>
+      <w:r>
+        <w:t xml:space="preserve">(~90/yr). The AdaptVA viewer exposes aggregated hotspots; the underlying row-level dataset would enable watershed-by-watershed attribution.</w:t>
+      </w:r>
+    </w:p>
+    <w:p>
+      <w:pPr>
         <w:pStyle w:val="Compact"/>
-      </w:pPr>
-      <w:r>
-        <w:rPr>
-          <w:bCs/>
-          <w:b/>
-        </w:rPr>
-        <w:t xml:space="preserve">Jon Richardson’s VDH ESVA repair permit dataset with tax-map numbers</w:t>
-      </w:r>
-      <w:r>
-        <w:t xml:space="preserve"> </w:t>
-      </w:r>
-      <w:r>
-        <w:t xml:space="preserve">(~90/yr). The AdaptVA viewer exposes aggregated hotspots; the underlying row-level dataset would enable watershed-by-watershed attribution.</w:t>
-      </w:r>
-    </w:p>
-    <w:p>
-      <w:pPr>
         <w:numPr>
           <w:ilvl w:val="0"/>
           <w:numId w:val="1002"/>
         </w:numPr>
+      </w:pPr>
+      <w:r>
+        <w:rPr>
+          <w:b/>
+          <w:bCs/>
+        </w:rPr>
+        <w:t xml:space="preserve">VDH onsite sewage O&amp;M data for alternative onsite/discharging sewage systems (AOSS/ADSS)</w:t>
+      </w:r>
+      <w:r>
+        <w:t xml:space="preserve"> </w:t>
+      </w:r>
+      <w:r>
+        <w:t xml:space="preserve">on the Shore. VDH has stated this data is posted; I have not yet located the file.</w:t>
+      </w:r>
+    </w:p>
+    <w:p>
+      <w:pPr>
         <w:pStyle w:val="Compact"/>
-      </w:pPr>
-      <w:r>
-        <w:rPr>
-          <w:bCs/>
-          <w:b/>
-        </w:rPr>
-        <w:t xml:space="preserve">VDH onsite sewage O&amp;M data for alternative onsite/discharging sewage systems (AOSS/ADSS)</w:t>
-      </w:r>
-      <w:r>
-        <w:t xml:space="preserve"> </w:t>
-      </w:r>
-      <w:r>
-        <w:t xml:space="preserve">on the Shore. VDH has stated this data is posted; I have not yet located the file.</w:t>
-      </w:r>
-    </w:p>
-    <w:p>
-      <w:pPr>
         <w:numPr>
           <w:ilvl w:val="0"/>
           <w:numId w:val="1002"/>
         </w:numPr>
+      </w:pPr>
+      <w:r>
+        <w:rPr>
+          <w:b/>
+          <w:bCs/>
+        </w:rPr>
+        <w:t xml:space="preserve">ESHD / A-NPDC aggregated well-testing results</w:t>
+      </w:r>
+      <w:r>
+        <w:t xml:space="preserve"> </w:t>
+      </w:r>
+      <w:r>
+        <w:t xml:space="preserve">if they exist.</w:t>
+      </w:r>
+    </w:p>
+    <w:p>
+      <w:pPr>
         <w:pStyle w:val="Compact"/>
-      </w:pPr>
-      <w:r>
-        <w:rPr>
-          <w:bCs/>
-          <w:b/>
-        </w:rPr>
-        <w:t xml:space="preserve">ESHD / A-NPDC aggregated well-testing results</w:t>
-      </w:r>
-      <w:r>
-        <w:t xml:space="preserve"> </w:t>
-      </w:r>
-      <w:r>
-        <w:t xml:space="preserve">if they exist.</w:t>
-      </w:r>
-    </w:p>
-    <w:p>
-      <w:pPr>
         <w:numPr>
           <w:ilvl w:val="0"/>
           <w:numId w:val="1002"/>
         </w:numPr>
+      </w:pPr>
+      <w:r>
+        <w:rPr>
+          <w:b/>
+          <w:bCs/>
+        </w:rPr>
+        <w:t xml:space="preserve">Underlying GIS layers for Mitchell et al. 2021 CBSAG report</w:t>
+      </w:r>
+      <w:r>
+        <w:t xml:space="preserve"> </w:t>
+      </w:r>
+      <w:r>
+        <w:t xml:space="preserve">— contact</w:t>
+      </w:r>
+      <w:r>
+        <w:t xml:space="preserve"> </w:t>
+      </w:r>
+      <w:r>
+        <w:rPr>
+          <w:rStyle w:val="VerbatimChar"/>
+        </w:rPr>
+        <w:t xml:space="preserve">adaptvainfo@vims.edu</w:t>
+      </w:r>
+      <w:r>
+        <w:t xml:space="preserve"> </w:t>
+      </w:r>
+      <w:r>
+        <w:t xml:space="preserve">or Mitchell directly. Draft email in §6.</w:t>
+      </w:r>
+    </w:p>
+    <w:p>
+      <w:pPr>
         <w:pStyle w:val="Compact"/>
-      </w:pPr>
-      <w:r>
-        <w:rPr>
-          <w:bCs/>
-          <w:b/>
-        </w:rPr>
-        <w:t xml:space="preserve">Underlying GIS layers for Mitchell et al. 2021 CBSAG report</w:t>
-      </w:r>
-      <w:r>
-        <w:t xml:space="preserve"> </w:t>
-      </w:r>
-      <w:r>
-        <w:t xml:space="preserve">— contact</w:t>
-      </w:r>
-      <w:r>
-        <w:t xml:space="preserve"> </w:t>
-      </w:r>
-      <w:r>
-        <w:rPr>
-          <w:rStyle w:val="VerbatimChar"/>
-        </w:rPr>
-        <w:t xml:space="preserve">adaptvainfo@vims.edu</w:t>
-      </w:r>
-      <w:r>
-        <w:t xml:space="preserve"> </w:t>
-      </w:r>
-      <w:r>
-        <w:t xml:space="preserve">or Mitchell directly. Draft email in §6.</w:t>
-      </w:r>
-    </w:p>
-    <w:p>
-      <w:pPr>
         <w:numPr>
           <w:ilvl w:val="0"/>
           <w:numId w:val="1002"/>
         </w:numPr>
+      </w:pPr>
+      <w:r>
+        <w:rPr>
+          <w:b/>
+          <w:bCs/>
+        </w:rPr>
+        <w:t xml:space="preserve">Allison Reilly’s EPA</w:t>
+      </w:r>
+      <w:r>
+        <w:rPr>
+          <w:b/>
+          <w:bCs/>
+        </w:rPr>
+        <w:t xml:space="preserve"> </w:t>
+      </w:r>
+      <w:r>
+        <w:rPr>
+          <w:b/>
+          <w:bCs/>
+        </w:rPr>
+        <w:t xml:space="preserve">“Septic to Sewer”</w:t>
+      </w:r>
+      <w:r>
+        <w:rPr>
+          <w:b/>
+          <w:bCs/>
+        </w:rPr>
+        <w:t xml:space="preserve"> </w:t>
+      </w:r>
+      <w:r>
+        <w:rPr>
+          <w:b/>
+          <w:bCs/>
+        </w:rPr>
+        <w:t xml:space="preserve">project outputs</w:t>
+      </w:r>
+      <w:r>
+        <w:t xml:space="preserve"> </w:t>
+      </w:r>
+      <w:r>
+        <w:t xml:space="preserve">— she may already have a Mid-Atlantic analogue literature review.</w:t>
+      </w:r>
+    </w:p>
+    <w:p>
+      <w:pPr>
         <w:pStyle w:val="Compact"/>
-      </w:pPr>
-      <w:r>
-        <w:rPr>
-          <w:bCs/>
-          <w:b/>
-        </w:rPr>
-        <w:t xml:space="preserve">Allison Reilly’s EPA</w:t>
-      </w:r>
-      <w:r>
-        <w:rPr>
-          <w:bCs/>
-          <w:b/>
-        </w:rPr>
-        <w:t xml:space="preserve"> </w:t>
-      </w:r>
-      <w:r>
-        <w:rPr>
-          <w:bCs/>
-          <w:b/>
-        </w:rPr>
-        <w:t xml:space="preserve">“</w:t>
-      </w:r>
-      <w:r>
-        <w:rPr>
-          <w:bCs/>
-          <w:b/>
-        </w:rPr>
-        <w:t xml:space="preserve">Septic to Sewer</w:t>
-      </w:r>
-      <w:r>
-        <w:rPr>
-          <w:bCs/>
-          <w:b/>
-        </w:rPr>
-        <w:t xml:space="preserve">”</w:t>
-      </w:r>
-      <w:r>
-        <w:rPr>
-          <w:bCs/>
-          <w:b/>
-        </w:rPr>
-        <w:t xml:space="preserve"> </w:t>
-      </w:r>
-      <w:r>
-        <w:rPr>
-          <w:bCs/>
-          <w:b/>
-        </w:rPr>
-        <w:t xml:space="preserve">project outputs</w:t>
-      </w:r>
-      <w:r>
-        <w:t xml:space="preserve"> </w:t>
-      </w:r>
-      <w:r>
-        <w:t xml:space="preserve">— she may already have a Mid-Atlantic analogue literature review.</w:t>
-      </w:r>
-    </w:p>
-    <w:p>
-      <w:pPr>
         <w:numPr>
           <w:ilvl w:val="0"/>
           <w:numId w:val="1002"/>
         </w:numPr>
-        <w:pStyle w:val="Compact"/>
-      </w:pPr>
-      <w:r>
-        <w:rPr>
-          <w:bCs/>
-          <w:b/>
+      </w:pPr>
+      <w:r>
+        <w:rPr>
+          <w:b/>
+          <w:bCs/>
         </w:rPr>
         <w:t xml:space="preserve">ESVA Climate Equity project groundwater model outputs</w:t>
       </w:r>
@@ -1053,9 +1084,9 @@
         </w:pict>
       </w:r>
     </w:p>
-    <w:bookmarkEnd w:id="34"/>
-    <w:bookmarkEnd w:id="35"/>
-    <w:bookmarkStart w:id="36" w:name="deliverables"/>
+    <w:bookmarkEnd w:id="23"/>
+    <w:bookmarkEnd w:id="24"/>
+    <w:bookmarkStart w:id="25" w:name="deliverables"/>
     <w:p>
       <w:pPr>
         <w:pStyle w:val="Heading2"/>
@@ -1091,8 +1122,8 @@
       <w:tblPr>
         <w:tblStyle w:val="Table"/>
         <w:tblW w:type="pct" w:w="5000"/>
+        <w:tblLayout w:type="fixed"/>
         <w:tblLook w:firstRow="1" w:lastRow="0" w:firstColumn="0" w:lastColumn="0" w:noHBand="0" w:noVBand="0" w:val="0020"/>
-        <w:jc w:val="start"/>
       </w:tblPr>
       <w:tblGrid>
         <w:gridCol w:w="1980"/>
@@ -1102,14 +1133,13 @@
       </w:tblGrid>
       <w:tr>
         <w:trPr>
-          <w:tblHeader w:val="true"/>
+          <w:tblHeader w:val="on"/>
         </w:trPr>
         <w:tc>
           <w:tcPr/>
           <w:p>
             <w:pPr>
               <w:pStyle w:val="Compact"/>
-              <w:jc w:val="left"/>
             </w:pPr>
             <w:r>
               <w:t xml:space="preserve">File</w:t>
@@ -1121,7 +1151,6 @@
           <w:p>
             <w:pPr>
               <w:pStyle w:val="Compact"/>
-              <w:jc w:val="left"/>
             </w:pPr>
             <w:r>
               <w:t xml:space="preserve">Audience</w:t>
@@ -1133,7 +1162,6 @@
           <w:p>
             <w:pPr>
               <w:pStyle w:val="Compact"/>
-              <w:jc w:val="left"/>
             </w:pPr>
             <w:r>
               <w:t xml:space="preserve">Format</w:t>
@@ -1145,7 +1173,6 @@
           <w:p>
             <w:pPr>
               <w:pStyle w:val="Compact"/>
-              <w:jc w:val="left"/>
             </w:pPr>
             <w:r>
               <w:t xml:space="preserve">Status</w:t>
@@ -1159,7 +1186,6 @@
           <w:p>
             <w:pPr>
               <w:pStyle w:val="Compact"/>
-              <w:jc w:val="left"/>
             </w:pPr>
             <w:r>
               <w:rPr>
@@ -1174,7 +1200,6 @@
           <w:p>
             <w:pPr>
               <w:pStyle w:val="Compact"/>
-              <w:jc w:val="left"/>
             </w:pPr>
             <w:r>
               <w:t xml:space="preserve">Project team, capstone students, future grant narratives</w:t>
@@ -1186,7 +1211,6 @@
           <w:p>
             <w:pPr>
               <w:pStyle w:val="Compact"/>
-              <w:jc w:val="left"/>
             </w:pPr>
             <w:r>
               <w:t xml:space="preserve">Long-form scholarly synthesis, pathway-by-pathway, author-year citations</w:t>
@@ -1198,7 +1222,6 @@
           <w:p>
             <w:pPr>
               <w:pStyle w:val="Compact"/>
-              <w:jc w:val="left"/>
             </w:pPr>
             <w:r>
               <w:t xml:space="preserve">To be drafted (Phase 1–3)</w:t>
@@ -1212,7 +1235,6 @@
           <w:p>
             <w:pPr>
               <w:pStyle w:val="Compact"/>
-              <w:jc w:val="left"/>
             </w:pPr>
             <w:r>
               <w:rPr>
@@ -1227,7 +1249,6 @@
           <w:p>
             <w:pPr>
               <w:pStyle w:val="Compact"/>
-              <w:jc w:val="left"/>
             </w:pPr>
             <w:r>
               <w:t xml:space="preserve">Everyone</w:t>
@@ -1239,7 +1260,6 @@
           <w:p>
             <w:pPr>
               <w:pStyle w:val="Compact"/>
-              <w:jc w:val="left"/>
             </w:pPr>
             <w:r>
               <w:t xml:space="preserve">Annotated references grouped by pathway, living document</w:t>
@@ -1251,7 +1271,6 @@
           <w:p>
             <w:pPr>
               <w:pStyle w:val="Compact"/>
-              <w:jc w:val="left"/>
             </w:pPr>
             <w:r>
               <w:t xml:space="preserve">To be drafted alongside synthesis</w:t>
@@ -1265,7 +1284,6 @@
           <w:p>
             <w:pPr>
               <w:pStyle w:val="Compact"/>
-              <w:jc w:val="left"/>
             </w:pPr>
             <w:r>
               <w:rPr>
@@ -1280,7 +1298,6 @@
           <w:p>
             <w:pPr>
               <w:pStyle w:val="Compact"/>
-              <w:jc w:val="left"/>
             </w:pPr>
             <w:r>
               <w:t xml:space="preserve">PIs, grant writers (Expansion Stage)</w:t>
@@ -1292,7 +1309,6 @@
           <w:p>
             <w:pPr>
               <w:pStyle w:val="Compact"/>
-              <w:jc w:val="left"/>
             </w:pPr>
             <w:r>
               <w:t xml:space="preserve">Structured gap analysis: what’s unknown, what would fill it, what it would cost</w:t>
@@ -1304,7 +1320,6 @@
           <w:p>
             <w:pPr>
               <w:pStyle w:val="Compact"/>
-              <w:jc w:val="left"/>
             </w:pPr>
             <w:r>
               <w:t xml:space="preserve">To be drafted Phase 5</w:t>
@@ -1318,7 +1333,6 @@
           <w:p>
             <w:pPr>
               <w:pStyle w:val="Compact"/>
-              <w:jc w:val="left"/>
             </w:pPr>
             <w:r>
               <w:rPr>
@@ -1333,7 +1347,6 @@
           <w:p>
             <w:pPr>
               <w:pStyle w:val="Compact"/>
-              <w:jc w:val="left"/>
             </w:pPr>
             <w:r>
               <w:t xml:space="preserve">Alex, ESCC students</w:t>
@@ -1345,7 +1358,6 @@
           <w:p>
             <w:pPr>
               <w:pStyle w:val="Compact"/>
-              <w:jc w:val="left"/>
             </w:pPr>
             <w:r>
               <w:t xml:space="preserve">Specific student projects mapped to pathways, each with method and data source</w:t>
@@ -1357,7 +1369,6 @@
           <w:p>
             <w:pPr>
               <w:pStyle w:val="Compact"/>
-              <w:jc w:val="left"/>
             </w:pPr>
             <w:r>
               <w:t xml:space="preserve">To be drafted Phase 5</w:t>
@@ -1396,8 +1407,8 @@
         </w:pict>
       </w:r>
     </w:p>
-    <w:bookmarkEnd w:id="36"/>
-    <w:bookmarkStart w:id="37" w:name="execution-plan"/>
+    <w:bookmarkEnd w:id="25"/>
+    <w:bookmarkStart w:id="26" w:name="execution-plan"/>
     <w:p>
       <w:pPr>
         <w:pStyle w:val="Heading2"/>
@@ -1412,8 +1423,8 @@
       </w:pPr>
       <w:r>
         <w:rPr>
-          <w:bCs/>
-          <w:b/>
+          <w:b/>
+          <w:bCs/>
         </w:rPr>
         <w:t xml:space="preserve">Phase 1 — Foundation (literature pull by pathway).</w:t>
       </w:r>
@@ -1460,8 +1471,8 @@
       </w:pPr>
       <w:r>
         <w:rPr>
-          <w:bCs/>
-          <w:b/>
+          <w:b/>
+          <w:bCs/>
         </w:rPr>
         <w:t xml:space="preserve">Phase 2 — ESVA-specific evidence mining.</w:t>
       </w:r>
@@ -1478,8 +1489,8 @@
       </w:pPr>
       <w:r>
         <w:rPr>
-          <w:bCs/>
-          <w:b/>
+          <w:b/>
+          <w:bCs/>
         </w:rPr>
         <w:t xml:space="preserve">Phase 3 — Analogue synthesis.</w:t>
       </w:r>
@@ -1496,8 +1507,8 @@
       </w:pPr>
       <w:r>
         <w:rPr>
-          <w:bCs/>
-          <w:b/>
+          <w:b/>
+          <w:bCs/>
         </w:rPr>
         <w:t xml:space="preserve">Phase 4 — Resolution of the 6% vs. 3.3% Bay-nitrogen-from-septic figure.</w:t>
       </w:r>
@@ -1526,8 +1537,8 @@
       </w:pPr>
       <w:r>
         <w:rPr>
-          <w:bCs/>
-          <w:b/>
+          <w:b/>
+          <w:bCs/>
         </w:rPr>
         <w:t xml:space="preserve">Phase 5 — Gap analysis and capstone seeding.</w:t>
       </w:r>
@@ -1571,8 +1582,8 @@
       </w:pPr>
       <w:r>
         <w:rPr>
-          <w:bCs/>
-          <w:b/>
+          <w:b/>
+          <w:bCs/>
         </w:rPr>
         <w:t xml:space="preserve">Ongoing.</w:t>
       </w:r>
@@ -1590,8 +1601,8 @@
         </w:pict>
       </w:r>
     </w:p>
-    <w:bookmarkEnd w:id="37"/>
-    <w:bookmarkStart w:id="38" w:name="Xc66fa9ab27408d31960ef1e887bea0ab2afe7e6"/>
+    <w:bookmarkEnd w:id="26"/>
+    <w:bookmarkStart w:id="27" w:name="Xc66fa9ab27408d31960ef1e887bea0ab2afe7e6"/>
     <w:p>
       <w:pPr>
         <w:pStyle w:val="Heading2"/>
@@ -1644,8 +1655,8 @@
       </w:r>
       <w:r>
         <w:rPr>
+          <w:i/>
           <w:iCs/>
-          <w:i/>
         </w:rPr>
         <w:t xml:space="preserve">Frontiers in Marine Science</w:t>
       </w:r>
@@ -1658,23 +1669,23 @@
     </w:p>
     <w:p>
       <w:pPr>
+        <w:pStyle w:val="Compact"/>
         <w:numPr>
           <w:ilvl w:val="0"/>
           <w:numId w:val="1003"/>
         </w:numPr>
+      </w:pPr>
+      <w:r>
+        <w:t xml:space="preserve">Are the underlying GIS layers from the CBSAG analysis available for a sub-basin overlay against the Hesamfar/Culver SEAWAT outputs on ESVA? Specifically, the failed/failing/threatened classifications at tax-parcel or sub-watershed resolution, if they exist at that granularity.</w:t>
+      </w:r>
+    </w:p>
+    <w:p>
+      <w:pPr>
         <w:pStyle w:val="Compact"/>
-      </w:pPr>
-      <w:r>
-        <w:t xml:space="preserve">Are the underlying GIS layers from the CBSAG analysis available for a sub-basin overlay against the Hesamfar/Culver SEAWAT outputs on ESVA? Specifically, the failed/failing/threatened classifications at tax-parcel or sub-watershed resolution, if they exist at that granularity.</w:t>
-      </w:r>
-    </w:p>
-    <w:p>
-      <w:pPr>
         <w:numPr>
           <w:ilvl w:val="0"/>
           <w:numId w:val="1003"/>
         </w:numPr>
-        <w:pStyle w:val="Compact"/>
       </w:pPr>
       <w:r>
         <w:t xml:space="preserve">Does the AdaptVA team have a way to share septic repair permit row-level data (tax map / watershed level) for Accomack and Northampton, or should I route that request through VDH directly?</w:t>
@@ -1717,8 +1728,8 @@
         </w:pict>
       </w:r>
     </w:p>
-    <w:bookmarkEnd w:id="38"/>
-    <w:bookmarkStart w:id="39" w:name="questions-closed-in-this-strategy"/>
+    <w:bookmarkEnd w:id="27"/>
+    <w:bookmarkStart w:id="28" w:name="questions-closed-in-this-strategy"/>
     <w:p>
       <w:pPr>
         <w:pStyle w:val="Heading2"/>
@@ -1737,126 +1748,126 @@
     </w:p>
     <w:p>
       <w:pPr>
+        <w:pStyle w:val="Compact"/>
         <w:numPr>
           <w:ilvl w:val="0"/>
           <w:numId w:val="1004"/>
         </w:numPr>
+      </w:pPr>
+      <w:r>
+        <w:rPr>
+          <w:b/>
+          <w:bCs/>
+        </w:rPr>
+        <w:t xml:space="preserve">Citation style:</w:t>
+      </w:r>
+      <w:r>
+        <w:t xml:space="preserve"> </w:t>
+      </w:r>
+      <w:r>
+        <w:t xml:space="preserve">author-year inline, full references at the end.</w:t>
+      </w:r>
+    </w:p>
+    <w:p>
+      <w:pPr>
         <w:pStyle w:val="Compact"/>
-      </w:pPr>
-      <w:r>
-        <w:rPr>
-          <w:bCs/>
-          <w:b/>
-        </w:rPr>
-        <w:t xml:space="preserve">Citation style:</w:t>
-      </w:r>
-      <w:r>
-        <w:t xml:space="preserve"> </w:t>
-      </w:r>
-      <w:r>
-        <w:t xml:space="preserve">author-year inline, full references at the end.</w:t>
-      </w:r>
-    </w:p>
-    <w:p>
-      <w:pPr>
         <w:numPr>
           <w:ilvl w:val="0"/>
           <w:numId w:val="1004"/>
         </w:numPr>
+      </w:pPr>
+      <w:r>
+        <w:rPr>
+          <w:b/>
+          <w:bCs/>
+        </w:rPr>
+        <w:t xml:space="preserve">Analogue region depth:</w:t>
+      </w:r>
+      <w:r>
+        <w:t xml:space="preserve"> </w:t>
+      </w:r>
+      <w:r>
+        <w:t xml:space="preserve">use judgment; first-tier analogues are those that share coastal-plain shallow-aquifer hydrology and rural-septic density (Cape Cod, Rhode Island, Dare County NC, coastal Georgia, Indian River Lagoon FL). Second-tier as needed.</w:t>
+      </w:r>
+    </w:p>
+    <w:p>
+      <w:pPr>
         <w:pStyle w:val="Compact"/>
-      </w:pPr>
-      <w:r>
-        <w:rPr>
-          <w:bCs/>
-          <w:b/>
-        </w:rPr>
-        <w:t xml:space="preserve">Analogue region depth:</w:t>
-      </w:r>
-      <w:r>
-        <w:t xml:space="preserve"> </w:t>
-      </w:r>
-      <w:r>
-        <w:t xml:space="preserve">use judgment; first-tier analogues are those that share coastal-plain shallow-aquifer hydrology and rural-septic density (Cape Cod, Rhode Island, Dare County NC, coastal Georgia, Indian River Lagoon FL). Second-tier as needed.</w:t>
-      </w:r>
-    </w:p>
-    <w:p>
-      <w:pPr>
         <w:numPr>
           <w:ilvl w:val="0"/>
           <w:numId w:val="1004"/>
         </w:numPr>
+      </w:pPr>
+      <w:r>
+        <w:rPr>
+          <w:b/>
+          <w:bCs/>
+        </w:rPr>
+        <w:t xml:space="preserve">Chesapeake Bay vs. Seaside split:</w:t>
+      </w:r>
+      <w:r>
+        <w:t xml:space="preserve"> </w:t>
+      </w:r>
+      <w:r>
+        <w:t xml:space="preserve">treated as two sub-pathways (3a and 3b), separated where hydrology/biota/management diverge, synthesized where the mechanism is identical.</w:t>
+      </w:r>
+    </w:p>
+    <w:p>
+      <w:pPr>
         <w:pStyle w:val="Compact"/>
-      </w:pPr>
-      <w:r>
-        <w:rPr>
-          <w:bCs/>
-          <w:b/>
-        </w:rPr>
-        <w:t xml:space="preserve">Chesapeake Bay vs. Seaside split:</w:t>
-      </w:r>
-      <w:r>
-        <w:t xml:space="preserve"> </w:t>
-      </w:r>
-      <w:r>
-        <w:t xml:space="preserve">treated as two sub-pathways (3a and 3b), separated where hydrology/biota/management diverge, synthesized where the mechanism is identical.</w:t>
-      </w:r>
-    </w:p>
-    <w:p>
-      <w:pPr>
         <w:numPr>
           <w:ilvl w:val="0"/>
           <w:numId w:val="1004"/>
         </w:numPr>
+      </w:pPr>
+      <w:r>
+        <w:rPr>
+          <w:b/>
+          <w:bCs/>
+        </w:rPr>
+        <w:t xml:space="preserve">Tone:</w:t>
+      </w:r>
+      <w:r>
+        <w:t xml:space="preserve"> </w:t>
+      </w:r>
+      <w:r>
+        <w:t xml:space="preserve">scholarly research synthesis. Outreach adaptation deferred to a later phase.</w:t>
+      </w:r>
+    </w:p>
+    <w:p>
+      <w:pPr>
         <w:pStyle w:val="Compact"/>
-      </w:pPr>
-      <w:r>
-        <w:rPr>
-          <w:bCs/>
-          <w:b/>
-        </w:rPr>
-        <w:t xml:space="preserve">Tone:</w:t>
-      </w:r>
-      <w:r>
-        <w:t xml:space="preserve"> </w:t>
-      </w:r>
-      <w:r>
-        <w:t xml:space="preserve">scholarly research synthesis. Outreach adaptation deferred to a later phase.</w:t>
-      </w:r>
-    </w:p>
-    <w:p>
-      <w:pPr>
         <w:numPr>
           <w:ilvl w:val="0"/>
           <w:numId w:val="1004"/>
         </w:numPr>
+      </w:pPr>
+      <w:r>
+        <w:rPr>
+          <w:b/>
+          <w:bCs/>
+        </w:rPr>
+        <w:t xml:space="preserve">Mitchell contact:</w:t>
+      </w:r>
+      <w:r>
+        <w:t xml:space="preserve"> </w:t>
+      </w:r>
+      <w:r>
+        <w:t xml:space="preserve">yes — draft email in §6.</w:t>
+      </w:r>
+    </w:p>
+    <w:p>
+      <w:pPr>
         <w:pStyle w:val="Compact"/>
-      </w:pPr>
-      <w:r>
-        <w:rPr>
-          <w:bCs/>
-          <w:b/>
-        </w:rPr>
-        <w:t xml:space="preserve">Mitchell contact:</w:t>
-      </w:r>
-      <w:r>
-        <w:t xml:space="preserve"> </w:t>
-      </w:r>
-      <w:r>
-        <w:t xml:space="preserve">yes — draft email in §6.</w:t>
-      </w:r>
-    </w:p>
-    <w:p>
-      <w:pPr>
         <w:numPr>
           <w:ilvl w:val="0"/>
           <w:numId w:val="1004"/>
         </w:numPr>
-        <w:pStyle w:val="Compact"/>
-      </w:pPr>
-      <w:r>
-        <w:rPr>
-          <w:bCs/>
-          <w:b/>
+      </w:pPr>
+      <w:r>
+        <w:rPr>
+          <w:b/>
+          <w:bCs/>
         </w:rPr>
         <w:t xml:space="preserve">6% vs. 3.3% Bay-nitrogen figure:</w:t>
       </w:r>
@@ -1880,15 +1891,19 @@
       </w:pPr>
       <w:r>
         <w:rPr>
+          <w:i/>
           <w:iCs/>
-          <w:i/>
         </w:rPr>
         <w:t xml:space="preserve">This document is a living scoping artifact. Revise freely as the research progresses and cite the revision in the next commit.</w:t>
       </w:r>
     </w:p>
-    <w:bookmarkEnd w:id="39"/>
-    <w:bookmarkEnd w:id="40"/>
-    <w:sectPr/>
+    <w:bookmarkEnd w:id="28"/>
+    <w:bookmarkEnd w:id="29"/>
+    <w:sectPr>
+      <w:footnotePr>
+        <w:numRestart w:val="eachSect"/>
+      </w:footnotePr>
+    </w:sectPr>
   </w:body>
 </w:document>
 </file>
@@ -1919,14 +1934,14 @@
 <file path=word/numbering.xml><?xml version="1.0" encoding="utf-8"?>
 <w:numbering xmlns:w="http://schemas.openxmlformats.org/wordprocessingml/2006/main">
   <w:abstractNum w:abstractNumId="990">
-    <w:nsid w:val="A990"/>
+    <w:nsid w:val="0000A990"/>
     <w:multiLevelType w:val="multilevel"/>
     <w:lvl w:ilvl="0">
       <w:numFmt w:val="bullet"/>
       <w:lvlText w:val=" "/>
       <w:lvlJc w:val="left"/>
       <w:pPr>
-        <w:ind w:left="720" w:hanging="480"/>
+        <w:ind w:left="720" w:hanging="360"/>
       </w:pPr>
     </w:lvl>
     <w:lvl w:ilvl="1">
@@ -1934,7 +1949,7 @@
       <w:lvlText w:val=" "/>
       <w:lvlJc w:val="left"/>
       <w:pPr>
-        <w:ind w:left="1440" w:hanging="480"/>
+        <w:ind w:left="1440" w:hanging="360"/>
       </w:pPr>
     </w:lvl>
     <w:lvl w:ilvl="2">
@@ -1942,7 +1957,7 @@
       <w:lvlText w:val=" "/>
       <w:lvlJc w:val="left"/>
       <w:pPr>
-        <w:ind w:left="2160" w:hanging="480"/>
+        <w:ind w:left="2160" w:hanging="360"/>
       </w:pPr>
     </w:lvl>
     <w:lvl w:ilvl="3">
@@ -1950,7 +1965,7 @@
       <w:lvlText w:val=" "/>
       <w:lvlJc w:val="left"/>
       <w:pPr>
-        <w:ind w:left="2880" w:hanging="480"/>
+        <w:ind w:left="2880" w:hanging="360"/>
       </w:pPr>
     </w:lvl>
     <w:lvl w:ilvl="4">
@@ -1958,7 +1973,7 @@
       <w:lvlText w:val=" "/>
       <w:lvlJc w:val="left"/>
       <w:pPr>
-        <w:ind w:left="3600" w:hanging="480"/>
+        <w:ind w:left="3600" w:hanging="360"/>
       </w:pPr>
     </w:lvl>
     <w:lvl w:ilvl="5">
@@ -1966,7 +1981,7 @@
       <w:lvlText w:val=" "/>
       <w:lvlJc w:val="left"/>
       <w:pPr>
-        <w:ind w:left="4320" w:hanging="480"/>
+        <w:ind w:left="4320" w:hanging="360"/>
       </w:pPr>
     </w:lvl>
     <w:lvl w:ilvl="6">
@@ -1974,7 +1989,7 @@
       <w:lvlText w:val=" "/>
       <w:lvlJc w:val="left"/>
       <w:pPr>
-        <w:ind w:left="5040" w:hanging="480"/>
+        <w:ind w:left="5040" w:hanging="360"/>
       </w:pPr>
     </w:lvl>
     <w:lvl w:ilvl="7">
@@ -1982,7 +1997,7 @@
       <w:lvlText w:val=" "/>
       <w:lvlJc w:val="left"/>
       <w:pPr>
-        <w:ind w:left="5760" w:hanging="480"/>
+        <w:ind w:left="5760" w:hanging="360"/>
       </w:pPr>
     </w:lvl>
     <w:lvl w:ilvl="8">
@@ -1990,88 +2005,115 @@
       <w:lvlText w:val=" "/>
       <w:lvlJc w:val="left"/>
       <w:pPr>
-        <w:ind w:left="6480" w:hanging="480"/>
+        <w:ind w:left="6480" w:hanging="360"/>
       </w:pPr>
     </w:lvl>
   </w:abstractNum>
   <w:abstractNum w:abstractNumId="991">
-    <w:nsid w:val="A991"/>
+    <w:nsid w:val="0000A991"/>
     <w:multiLevelType w:val="multilevel"/>
     <w:lvl w:ilvl="0">
       <w:numFmt w:val="bullet"/>
-      <w:lvlText w:val="•"/>
+      <w:lvlText w:val=""/>
       <w:lvlJc w:val="left"/>
       <w:pPr>
-        <w:ind w:left="720" w:hanging="480"/>
-      </w:pPr>
+        <w:ind w:left="720" w:hanging="360"/>
+      </w:pPr>
+      <w:rPr>
+        <w:rFonts w:ascii="Symbol" w:hAnsi="Symbol" w:cs="Symbol" w:hint="default"/>
+      </w:rPr>
     </w:lvl>
     <w:lvl w:ilvl="1">
       <w:numFmt w:val="bullet"/>
-      <w:lvlText w:val="–"/>
+      <w:lvlText w:val="o"/>
       <w:lvlJc w:val="left"/>
       <w:pPr>
-        <w:ind w:left="1440" w:hanging="480"/>
-      </w:pPr>
+        <w:ind w:left="1440" w:hanging="360"/>
+      </w:pPr>
+      <w:rPr>
+        <w:rFonts w:ascii="Courier New" w:hAnsi="Courier New" w:cs="Courier New" w:hint="default"/>
+      </w:rPr>
     </w:lvl>
     <w:lvl w:ilvl="2">
       <w:numFmt w:val="bullet"/>
-      <w:lvlText w:val="•"/>
+      <w:lvlText w:val=""/>
       <w:lvlJc w:val="left"/>
       <w:pPr>
-        <w:ind w:left="2160" w:hanging="480"/>
-      </w:pPr>
+        <w:ind w:left="2160" w:hanging="360"/>
+      </w:pPr>
+      <w:rPr>
+        <w:rFonts w:ascii="Wingdings" w:hAnsi="Wingdings" w:cs="Wingdings" w:hint="default"/>
+      </w:rPr>
     </w:lvl>
     <w:lvl w:ilvl="3">
       <w:numFmt w:val="bullet"/>
-      <w:lvlText w:val="–"/>
+      <w:lvlText w:val=""/>
       <w:lvlJc w:val="left"/>
       <w:pPr>
-        <w:ind w:left="2880" w:hanging="480"/>
-      </w:pPr>
+        <w:ind w:left="2880" w:hanging="360"/>
+      </w:pPr>
+      <w:rPr>
+        <w:rFonts w:ascii="Symbol" w:hAnsi="Symbol" w:cs="Symbol" w:hint="default"/>
+      </w:rPr>
     </w:lvl>
     <w:lvl w:ilvl="4">
       <w:numFmt w:val="bullet"/>
-      <w:lvlText w:val="•"/>
+      <w:lvlText w:val="o"/>
       <w:lvlJc w:val="left"/>
       <w:pPr>
-        <w:ind w:left="3600" w:hanging="480"/>
-      </w:pPr>
+        <w:ind w:left="3600" w:hanging="360"/>
+      </w:pPr>
+      <w:rPr>
+        <w:rFonts w:ascii="Courier New" w:hAnsi="Courier New" w:cs="Courier New" w:hint="default"/>
+      </w:rPr>
     </w:lvl>
     <w:lvl w:ilvl="5">
       <w:numFmt w:val="bullet"/>
-      <w:lvlText w:val="–"/>
+      <w:lvlText w:val=""/>
       <w:lvlJc w:val="left"/>
       <w:pPr>
-        <w:ind w:left="4320" w:hanging="480"/>
-      </w:pPr>
+        <w:ind w:left="4320" w:hanging="360"/>
+      </w:pPr>
+      <w:rPr>
+        <w:rFonts w:ascii="Wingdings" w:hAnsi="Wingdings" w:cs="Wingdings" w:hint="default"/>
+      </w:rPr>
     </w:lvl>
     <w:lvl w:ilvl="6">
       <w:numFmt w:val="bullet"/>
-      <w:lvlText w:val="•"/>
+      <w:lvlText w:val=""/>
       <w:lvlJc w:val="left"/>
       <w:pPr>
-        <w:ind w:left="5040" w:hanging="480"/>
-      </w:pPr>
+        <w:ind w:left="5040" w:hanging="360"/>
+      </w:pPr>
+      <w:rPr>
+        <w:rFonts w:ascii="Symbol" w:hAnsi="Symbol" w:cs="Symbol" w:hint="default"/>
+      </w:rPr>
     </w:lvl>
     <w:lvl w:ilvl="7">
       <w:numFmt w:val="bullet"/>
-      <w:lvlText w:val="–"/>
+      <w:lvlText w:val="o"/>
       <w:lvlJc w:val="left"/>
       <w:pPr>
-        <w:ind w:left="5760" w:hanging="480"/>
-      </w:pPr>
+        <w:ind w:left="5760" w:hanging="360"/>
+      </w:pPr>
+      <w:rPr>
+        <w:rFonts w:ascii="Courier New" w:hAnsi="Courier New" w:cs="Courier New" w:hint="default"/>
+      </w:rPr>
     </w:lvl>
     <w:lvl w:ilvl="8">
       <w:numFmt w:val="bullet"/>
-      <w:lvlText w:val="•"/>
+      <w:lvlText w:val=""/>
       <w:lvlJc w:val="left"/>
       <w:pPr>
-        <w:ind w:left="6480" w:hanging="480"/>
-      </w:pPr>
+        <w:ind w:left="6480" w:hanging="360"/>
+      </w:pPr>
+      <w:rPr>
+        <w:rFonts w:ascii="Wingdings" w:hAnsi="Wingdings" w:cs="Wingdings" w:hint="default"/>
+      </w:rPr>
     </w:lvl>
   </w:abstractNum>
   <w:abstractNum w:abstractNumId="99411">
-    <w:nsid w:val="A99411"/>
+    <w:nsid w:val="00A99411"/>
     <w:multiLevelType w:val="multilevel"/>
     <w:lvl w:ilvl="0">
       <w:start w:val="1"/>
@@ -2079,7 +2121,7 @@
       <w:lvlText w:val="%1."/>
       <w:lvlJc w:val="left"/>
       <w:pPr>
-        <w:ind w:left="720" w:hanging="480"/>
+        <w:ind w:left="720" w:hanging="360"/>
       </w:pPr>
     </w:lvl>
     <w:lvl w:ilvl="1">
@@ -2088,7 +2130,7 @@
       <w:lvlText w:val="%2."/>
       <w:lvlJc w:val="left"/>
       <w:pPr>
-        <w:ind w:left="1440" w:hanging="480"/>
+        <w:ind w:left="1440" w:hanging="360"/>
       </w:pPr>
     </w:lvl>
     <w:lvl w:ilvl="2">
@@ -2097,7 +2139,7 @@
       <w:lvlText w:val="%3."/>
       <w:lvlJc w:val="left"/>
       <w:pPr>
-        <w:ind w:left="2160" w:hanging="480"/>
+        <w:ind w:left="2160" w:hanging="360"/>
       </w:pPr>
     </w:lvl>
     <w:lvl w:ilvl="3">
@@ -2106,7 +2148,7 @@
       <w:lvlText w:val="%4."/>
       <w:lvlJc w:val="left"/>
       <w:pPr>
-        <w:ind w:left="2880" w:hanging="480"/>
+        <w:ind w:left="2880" w:hanging="360"/>
       </w:pPr>
     </w:lvl>
     <w:lvl w:ilvl="4">
@@ -2115,7 +2157,7 @@
       <w:lvlText w:val="%5."/>
       <w:lvlJc w:val="left"/>
       <w:pPr>
-        <w:ind w:left="3600" w:hanging="480"/>
+        <w:ind w:left="3600" w:hanging="360"/>
       </w:pPr>
     </w:lvl>
     <w:lvl w:ilvl="5">
@@ -2124,7 +2166,7 @@
       <w:lvlText w:val="%6."/>
       <w:lvlJc w:val="left"/>
       <w:pPr>
-        <w:ind w:left="4320" w:hanging="480"/>
+        <w:ind w:left="4320" w:hanging="360"/>
       </w:pPr>
     </w:lvl>
     <w:lvl w:ilvl="6">
@@ -2133,7 +2175,7 @@
       <w:lvlText w:val="%7."/>
       <w:lvlJc w:val="left"/>
       <w:pPr>
-        <w:ind w:left="5040" w:hanging="480"/>
+        <w:ind w:left="5040" w:hanging="360"/>
       </w:pPr>
     </w:lvl>
     <w:lvl w:ilvl="7">
@@ -2142,7 +2184,7 @@
       <w:lvlText w:val="%8."/>
       <w:lvlJc w:val="left"/>
       <w:pPr>
-        <w:ind w:left="5760" w:hanging="480"/>
+        <w:ind w:left="5760" w:hanging="360"/>
       </w:pPr>
     </w:lvl>
     <w:lvl w:ilvl="8">
@@ -2151,7 +2193,7 @@
       <w:lvlText w:val="%9."/>
       <w:lvlJc w:val="left"/>
       <w:pPr>
-        <w:ind w:left="6480" w:hanging="480"/>
+        <w:ind w:left="6480" w:hanging="360"/>
       </w:pPr>
     </w:lvl>
   </w:abstractNum>
@@ -2259,10 +2301,10 @@
   <w:docDefaults>
     <w:rPrDefault>
       <w:rPr>
-        <w:rFonts w:asciiTheme="minorHAnsi" w:cstheme="minorBidi" w:eastAsiaTheme="minorHAnsi" w:hAnsiTheme="minorHAnsi"/>
+        <w:rFonts w:asciiTheme="minorHAnsi" w:cstheme="minorBidi" w:eastAsiaTheme="minorEastAsia" w:hAnsiTheme="minorHAnsi"/>
         <w:sz w:val="24"/>
         <w:szCs w:val="24"/>
-        <w:lang w:bidi="ar-SA" w:eastAsia="en-US" w:val="en-US"/>
+        <w:lang w:bidi="ar-SA" w:eastAsia="zh-CN" w:val="en-US"/>
       </w:rPr>
     </w:rPrDefault>
     <w:pPrDefault>
@@ -2280,10 +2322,10 @@
     <w:name w:val="Body Text"/>
     <w:basedOn w:val="Normal"/>
     <w:link w:val="BodyTextChar"/>
+    <w:qFormat/>
     <w:pPr>
       <w:spacing w:after="180" w:before="180"/>
     </w:pPr>
-    <w:qFormat/>
   </w:style>
   <w:style w:customStyle="1" w:styleId="FirstParagraph" w:type="paragraph">
     <w:name w:val="First Paragraph"/>
@@ -2303,57 +2345,94 @@
     <w:name w:val="Title"/>
     <w:basedOn w:val="Normal"/>
     <w:next w:val="BodyText"/>
+    <w:link w:val="TitleChar"/>
+    <w:uiPriority w:val="10"/>
     <w:qFormat/>
+    <w:rsid w:val="00A10FD9"/>
     <w:pPr>
-      <w:keepNext/>
-      <w:keepLines/>
-      <w:spacing w:after="240" w:before="480"/>
+      <w:spacing w:after="80" w:line="240" w:lineRule="auto"/>
+      <w:contextualSpacing/>
       <w:jc w:val="center"/>
     </w:pPr>
     <w:rPr>
       <w:rFonts w:asciiTheme="majorHAnsi" w:cstheme="majorBidi" w:eastAsiaTheme="majorEastAsia" w:hAnsiTheme="majorHAnsi"/>
-      <w:b/>
-      <w:bCs/>
-      <w:color w:themeColor="accent1" w:themeShade="B5" w:val="345A8A"/>
-      <w:sz w:val="36"/>
-      <w:szCs w:val="36"/>
+      <w:sz w:val="56"/>
+      <w:szCs w:val="56"/>
+    </w:rPr>
+  </w:style>
+  <w:style w:customStyle="1" w:styleId="TitleChar" w:type="character">
+    <w:name w:val="Title Char"/>
+    <w:basedOn w:val="DefaultParagraphFont"/>
+    <w:link w:val="Title"/>
+    <w:uiPriority w:val="10"/>
+    <w:rsid w:val="00A10FD9"/>
+    <w:rPr>
+      <w:rFonts w:asciiTheme="majorHAnsi" w:cstheme="majorBidi" w:eastAsiaTheme="majorEastAsia" w:hAnsiTheme="majorHAnsi"/>
+      <w:sz w:val="56"/>
+      <w:szCs w:val="56"/>
     </w:rPr>
   </w:style>
   <w:style w:styleId="Subtitle" w:type="paragraph">
     <w:name w:val="Subtitle"/>
+    <w:basedOn w:val="Title"/>
+    <w:next w:val="BodyText"/>
+    <w:link w:val="SubtitleChar"/>
+    <w:uiPriority w:val="11"/>
+    <w:qFormat/>
+    <w:rsid w:val="00A10FD9"/>
+    <w:pPr>
+      <w:numPr>
+        <w:ilvl w:val="1"/>
+      </w:numPr>
+    </w:pPr>
+    <w:rPr>
+      <w:rFonts w:cstheme="majorBidi" w:eastAsiaTheme="majorEastAsia"/>
+      <w:spacing w:val="15"/>
+      <w:sz w:val="28"/>
+      <w:szCs w:val="28"/>
+    </w:rPr>
+  </w:style>
+  <w:style w:customStyle="1" w:styleId="SubtitleChar" w:type="character">
+    <w:name w:val="Subtitle Char"/>
+    <w:basedOn w:val="DefaultParagraphFont"/>
+    <w:link w:val="Subtitle"/>
+    <w:uiPriority w:val="11"/>
+    <w:rsid w:val="00A10FD9"/>
+    <w:rPr>
+      <w:rFonts w:cstheme="majorBidi" w:eastAsiaTheme="majorEastAsia"/>
+      <w:color w:themeColor="text1" w:themeTint="A6" w:val="595959"/>
+      <w:spacing w:val="15"/>
+      <w:sz w:val="28"/>
+      <w:szCs w:val="28"/>
+    </w:rPr>
+  </w:style>
+  <w:style w:customStyle="1" w:styleId="Author" w:type="paragraph">
+    <w:name w:val="Author"/>
     <w:basedOn w:val="Title"/>
     <w:next w:val="BodyText"/>
     <w:qFormat/>
     <w:pPr>
       <w:keepNext/>
       <w:keepLines/>
-      <w:spacing w:after="240" w:before="240"/>
-      <w:jc w:val="center"/>
     </w:pPr>
     <w:rPr>
-      <w:sz w:val="30"/>
-      <w:szCs w:val="30"/>
-    </w:rPr>
-  </w:style>
-  <w:style w:customStyle="1" w:styleId="Author" w:type="paragraph">
-    <w:name w:val="Author"/>
+      <w:sz w:val="24"/>
+      <w:szCs w:val="24"/>
+    </w:rPr>
+  </w:style>
+  <w:style w:styleId="Date" w:type="paragraph">
+    <w:name w:val="Date"/>
+    <w:basedOn w:val="Title"/>
     <w:next w:val="BodyText"/>
     <w:qFormat/>
     <w:pPr>
       <w:keepNext/>
       <w:keepLines/>
-      <w:jc w:val="center"/>
     </w:pPr>
-  </w:style>
-  <w:style w:styleId="Date" w:type="paragraph">
-    <w:name w:val="Date"/>
-    <w:next w:val="BodyText"/>
-    <w:qFormat/>
-    <w:pPr>
-      <w:keepNext/>
-      <w:keepLines/>
-      <w:jc w:val="center"/>
-    </w:pPr>
+    <w:rPr>
+      <w:sz w:val="24"/>
+      <w:szCs w:val="24"/>
+    </w:rPr>
   </w:style>
   <w:style w:customStyle="1" w:styleId="AbstractTitle" w:type="paragraph">
     <w:name w:val="Abstract Title"/>
@@ -2363,15 +2442,13 @@
     <w:pPr>
       <w:keepNext/>
       <w:keepLines/>
+      <w:spacing w:after="0" w:before="300"/>
       <w:jc w:val="center"/>
-      <w:spacing w:after="0" w:before="300"/>
     </w:pPr>
     <w:rPr>
+      <w:b/>
       <w:sz w:val="20"/>
       <w:szCs w:val="20"/>
-      <w:b/>
-      <w:color w:val="345A8A"/>
-      &gt;
     </w:rPr>
   </w:style>
   <w:style w:customStyle="1" w:styleId="Abstract" w:type="paragraph">
@@ -2398,191 +2475,321 @@
     <w:rPr/>
   </w:style>
   <w:style w:styleId="Heading1" w:type="paragraph">
-    <w:name w:val="Heading 1"/>
+    <w:name w:val="heading 1"/>
     <w:basedOn w:val="Normal"/>
     <w:next w:val="BodyText"/>
+    <w:link w:val="Heading1Char"/>
     <w:uiPriority w:val="9"/>
     <w:qFormat/>
+    <w:rsid w:val="00A10FD9"/>
     <w:pPr>
       <w:keepNext/>
       <w:keepLines/>
-      <w:spacing w:after="0" w:before="480"/>
+      <w:spacing w:after="80" w:before="360"/>
       <w:outlineLvl w:val="0"/>
     </w:pPr>
     <w:rPr>
       <w:rFonts w:asciiTheme="majorHAnsi" w:cstheme="majorBidi" w:eastAsiaTheme="majorEastAsia" w:hAnsiTheme="majorHAnsi"/>
-      <w:b/>
-      <w:bCs/>
-      <w:color w:themeColor="accent1" w:val="4F81BD"/>
-      <w:sz w:val="32"/>
-      <w:szCs w:val="32"/>
+      <w:color w:themeColor="accent1" w:themeShade="BF" w:val="0F4761"/>
+      <w:sz w:val="40"/>
+      <w:szCs w:val="40"/>
     </w:rPr>
   </w:style>
   <w:style w:styleId="Heading2" w:type="paragraph">
-    <w:name w:val="Heading 2"/>
+    <w:name w:val="heading 2"/>
     <w:basedOn w:val="Normal"/>
     <w:next w:val="BodyText"/>
+    <w:link w:val="Heading2Char"/>
     <w:uiPriority w:val="9"/>
+    <w:semiHidden/>
     <w:unhideWhenUsed/>
     <w:qFormat/>
+    <w:rsid w:val="00A10FD9"/>
     <w:pPr>
       <w:keepNext/>
       <w:keepLines/>
-      <w:spacing w:after="0" w:before="200"/>
+      <w:spacing w:after="80" w:before="160"/>
       <w:outlineLvl w:val="1"/>
     </w:pPr>
     <w:rPr>
       <w:rFonts w:asciiTheme="majorHAnsi" w:cstheme="majorBidi" w:eastAsiaTheme="majorEastAsia" w:hAnsiTheme="majorHAnsi"/>
-      <w:b/>
-      <w:bCs/>
-      <w:color w:themeColor="accent1" w:val="4F81BD"/>
-      <w:sz w:val="28"/>
-      <w:szCs w:val="28"/>
+      <w:color w:themeColor="accent1" w:themeShade="BF" w:val="0F4761"/>
+      <w:sz w:val="32"/>
+      <w:szCs w:val="32"/>
     </w:rPr>
   </w:style>
   <w:style w:styleId="Heading3" w:type="paragraph">
-    <w:name w:val="Heading 3"/>
+    <w:name w:val="heading 3"/>
     <w:basedOn w:val="Normal"/>
     <w:next w:val="BodyText"/>
+    <w:link w:val="Heading3Char"/>
     <w:uiPriority w:val="9"/>
+    <w:semiHidden/>
     <w:unhideWhenUsed/>
     <w:qFormat/>
+    <w:rsid w:val="00A10FD9"/>
     <w:pPr>
       <w:keepNext/>
       <w:keepLines/>
-      <w:spacing w:after="0" w:before="200"/>
+      <w:spacing w:after="80" w:before="160"/>
       <w:outlineLvl w:val="2"/>
     </w:pPr>
     <w:rPr>
-      <w:rFonts w:asciiTheme="majorHAnsi" w:cstheme="majorBidi" w:eastAsiaTheme="majorEastAsia" w:hAnsiTheme="majorHAnsi"/>
-      <w:b/>
-      <w:bCs/>
-      <w:color w:themeColor="accent1" w:val="4F81BD"/>
-      <w:sz w:val="24"/>
-      <w:szCs w:val="24"/>
+      <w:rFonts w:cstheme="majorBidi" w:eastAsiaTheme="majorEastAsia"/>
+      <w:color w:themeColor="accent1" w:themeShade="BF" w:val="0F4761"/>
+      <w:sz w:val="28"/>
+      <w:szCs w:val="28"/>
     </w:rPr>
   </w:style>
   <w:style w:styleId="Heading4" w:type="paragraph">
-    <w:name w:val="Heading 4"/>
+    <w:name w:val="heading 4"/>
     <w:basedOn w:val="Normal"/>
     <w:next w:val="BodyText"/>
+    <w:link w:val="Heading4Char"/>
     <w:uiPriority w:val="9"/>
+    <w:semiHidden/>
     <w:unhideWhenUsed/>
     <w:qFormat/>
+    <w:rsid w:val="00A10FD9"/>
     <w:pPr>
       <w:keepNext/>
       <w:keepLines/>
-      <w:spacing w:after="0" w:before="200"/>
+      <w:spacing w:after="40" w:before="80"/>
       <w:outlineLvl w:val="3"/>
     </w:pPr>
     <w:rPr>
-      <w:rFonts w:asciiTheme="majorHAnsi" w:cstheme="majorBidi" w:eastAsiaTheme="majorEastAsia" w:hAnsiTheme="majorHAnsi"/>
+      <w:rFonts w:cstheme="majorBidi" w:eastAsiaTheme="majorEastAsia"/>
       <w:i/>
-      <w:bCs/>
-      <w:color w:themeColor="accent1" w:val="4F81BD"/>
-      <w:sz w:val="24"/>
-      <w:szCs w:val="24"/>
+      <w:iCs/>
+      <w:color w:themeColor="accent1" w:themeShade="BF" w:val="0F4761"/>
     </w:rPr>
   </w:style>
   <w:style w:styleId="Heading5" w:type="paragraph">
-    <w:name w:val="Heading 5"/>
+    <w:name w:val="heading 5"/>
     <w:basedOn w:val="Normal"/>
     <w:next w:val="BodyText"/>
+    <w:link w:val="Heading5Char"/>
     <w:uiPriority w:val="9"/>
+    <w:semiHidden/>
     <w:unhideWhenUsed/>
     <w:qFormat/>
+    <w:rsid w:val="00A10FD9"/>
     <w:pPr>
       <w:keepNext/>
       <w:keepLines/>
-      <w:spacing w:after="0" w:before="200"/>
+      <w:spacing w:after="40" w:before="80"/>
       <w:outlineLvl w:val="4"/>
     </w:pPr>
     <w:rPr>
-      <w:rFonts w:asciiTheme="majorHAnsi" w:cstheme="majorBidi" w:eastAsiaTheme="majorEastAsia" w:hAnsiTheme="majorHAnsi"/>
-      <w:iCs/>
-      <w:color w:themeColor="accent1" w:val="4F81BD"/>
-      <w:sz w:val="24"/>
-      <w:szCs w:val="24"/>
+      <w:rFonts w:cstheme="majorBidi" w:eastAsiaTheme="majorEastAsia"/>
+      <w:color w:themeColor="accent1" w:themeShade="BF" w:val="0F4761"/>
     </w:rPr>
   </w:style>
   <w:style w:styleId="Heading6" w:type="paragraph">
-    <w:name w:val="Heading 6"/>
+    <w:name w:val="heading 6"/>
     <w:basedOn w:val="Normal"/>
     <w:next w:val="BodyText"/>
+    <w:link w:val="Heading6Char"/>
     <w:uiPriority w:val="9"/>
+    <w:semiHidden/>
     <w:unhideWhenUsed/>
     <w:qFormat/>
+    <w:rsid w:val="00A10FD9"/>
     <w:pPr>
       <w:keepNext/>
       <w:keepLines/>
-      <w:spacing w:after="0" w:before="200"/>
+      <w:spacing w:after="0" w:before="40"/>
       <w:outlineLvl w:val="5"/>
     </w:pPr>
     <w:rPr>
-      <w:rFonts w:asciiTheme="majorHAnsi" w:cstheme="majorBidi" w:eastAsiaTheme="majorEastAsia" w:hAnsiTheme="majorHAnsi"/>
-      <w:color w:themeColor="accent1" w:val="4F81BD"/>
-      <w:sz w:val="24"/>
-      <w:szCs w:val="24"/>
+      <w:rFonts w:cstheme="majorBidi" w:eastAsiaTheme="majorEastAsia"/>
+      <w:i/>
+      <w:iCs/>
+      <w:color w:themeColor="text1" w:themeTint="A6" w:val="595959"/>
     </w:rPr>
   </w:style>
   <w:style w:styleId="Heading7" w:type="paragraph">
-    <w:name w:val="Heading 7"/>
+    <w:name w:val="heading 7"/>
     <w:basedOn w:val="Normal"/>
     <w:next w:val="BodyText"/>
+    <w:link w:val="Heading7Char"/>
     <w:uiPriority w:val="9"/>
+    <w:semiHidden/>
     <w:unhideWhenUsed/>
     <w:qFormat/>
+    <w:rsid w:val="00A10FD9"/>
     <w:pPr>
       <w:keepNext/>
       <w:keepLines/>
-      <w:spacing w:after="0" w:before="200"/>
+      <w:spacing w:after="0" w:before="40"/>
       <w:outlineLvl w:val="6"/>
     </w:pPr>
     <w:rPr>
-      <w:rFonts w:asciiTheme="majorHAnsi" w:cstheme="majorBidi" w:eastAsiaTheme="majorEastAsia" w:hAnsiTheme="majorHAnsi"/>
-      <w:color w:themeColor="accent1" w:val="4F81BD"/>
-      <w:sz w:val="24"/>
-      <w:szCs w:val="24"/>
+      <w:rFonts w:cstheme="majorBidi" w:eastAsiaTheme="majorEastAsia"/>
+      <w:color w:themeColor="text1" w:themeTint="A6" w:val="595959"/>
     </w:rPr>
   </w:style>
   <w:style w:styleId="Heading8" w:type="paragraph">
-    <w:name w:val="Heading 8"/>
+    <w:name w:val="heading 8"/>
     <w:basedOn w:val="Normal"/>
     <w:next w:val="BodyText"/>
+    <w:link w:val="Heading8Char"/>
     <w:uiPriority w:val="9"/>
+    <w:semiHidden/>
     <w:unhideWhenUsed/>
     <w:qFormat/>
+    <w:rsid w:val="00A10FD9"/>
     <w:pPr>
       <w:keepNext/>
       <w:keepLines/>
-      <w:spacing w:after="0" w:before="200"/>
+      <w:spacing w:after="0"/>
       <w:outlineLvl w:val="7"/>
     </w:pPr>
     <w:rPr>
-      <w:rFonts w:asciiTheme="majorHAnsi" w:cstheme="majorBidi" w:eastAsiaTheme="majorEastAsia" w:hAnsiTheme="majorHAnsi"/>
-      <w:color w:themeColor="accent1" w:val="4F81BD"/>
-      <w:sz w:val="24"/>
-      <w:szCs w:val="24"/>
+      <w:rFonts w:cstheme="majorBidi" w:eastAsiaTheme="majorEastAsia"/>
+      <w:i/>
+      <w:iCs/>
+      <w:color w:themeColor="text1" w:themeTint="D8" w:val="272727"/>
     </w:rPr>
   </w:style>
   <w:style w:styleId="Heading9" w:type="paragraph">
-    <w:name w:val="Heading 9"/>
+    <w:name w:val="heading 9"/>
     <w:basedOn w:val="Normal"/>
     <w:next w:val="BodyText"/>
+    <w:link w:val="Heading9Char"/>
     <w:uiPriority w:val="9"/>
+    <w:semiHidden/>
     <w:unhideWhenUsed/>
     <w:qFormat/>
+    <w:rsid w:val="00A10FD9"/>
     <w:pPr>
       <w:keepNext/>
       <w:keepLines/>
-      <w:spacing w:after="0" w:before="200"/>
+      <w:spacing w:after="0"/>
       <w:outlineLvl w:val="8"/>
     </w:pPr>
     <w:rPr>
+      <w:rFonts w:cstheme="majorBidi" w:eastAsiaTheme="majorEastAsia"/>
+      <w:color w:themeColor="text1" w:themeTint="D8" w:val="272727"/>
+    </w:rPr>
+  </w:style>
+  <w:style w:customStyle="1" w:styleId="Heading1Char" w:type="character">
+    <w:name w:val="Heading 1 Char"/>
+    <w:basedOn w:val="DefaultParagraphFont"/>
+    <w:link w:val="Heading1"/>
+    <w:uiPriority w:val="9"/>
+    <w:rsid w:val="00A10FD9"/>
+    <w:rPr>
       <w:rFonts w:asciiTheme="majorHAnsi" w:cstheme="majorBidi" w:eastAsiaTheme="majorEastAsia" w:hAnsiTheme="majorHAnsi"/>
-      <w:color w:themeColor="accent1" w:val="4F81BD"/>
-      <w:sz w:val="24"/>
-      <w:szCs w:val="24"/>
+      <w:color w:themeColor="accent1" w:themeShade="BF" w:val="0F4761"/>
+      <w:sz w:val="40"/>
+      <w:szCs w:val="40"/>
+    </w:rPr>
+  </w:style>
+  <w:style w:customStyle="1" w:styleId="Heading2Char" w:type="character">
+    <w:name w:val="Heading 2 Char"/>
+    <w:basedOn w:val="DefaultParagraphFont"/>
+    <w:link w:val="Heading2"/>
+    <w:uiPriority w:val="9"/>
+    <w:semiHidden/>
+    <w:rsid w:val="00A10FD9"/>
+    <w:rPr>
+      <w:rFonts w:asciiTheme="majorHAnsi" w:cstheme="majorBidi" w:eastAsiaTheme="majorEastAsia" w:hAnsiTheme="majorHAnsi"/>
+      <w:color w:themeColor="accent1" w:themeShade="BF" w:val="0F4761"/>
+      <w:sz w:val="32"/>
+      <w:szCs w:val="32"/>
+    </w:rPr>
+  </w:style>
+  <w:style w:customStyle="1" w:styleId="Heading3Char" w:type="character">
+    <w:name w:val="Heading 3 Char"/>
+    <w:basedOn w:val="DefaultParagraphFont"/>
+    <w:link w:val="Heading3"/>
+    <w:uiPriority w:val="9"/>
+    <w:semiHidden/>
+    <w:rsid w:val="00A10FD9"/>
+    <w:rPr>
+      <w:rFonts w:cstheme="majorBidi" w:eastAsiaTheme="majorEastAsia"/>
+      <w:color w:themeColor="accent1" w:themeShade="BF" w:val="0F4761"/>
+      <w:sz w:val="28"/>
+      <w:szCs w:val="28"/>
+    </w:rPr>
+  </w:style>
+  <w:style w:customStyle="1" w:styleId="Heading4Char" w:type="character">
+    <w:name w:val="Heading 4 Char"/>
+    <w:basedOn w:val="DefaultParagraphFont"/>
+    <w:link w:val="Heading4"/>
+    <w:uiPriority w:val="9"/>
+    <w:semiHidden/>
+    <w:rsid w:val="00A10FD9"/>
+    <w:rPr>
+      <w:rFonts w:cstheme="majorBidi" w:eastAsiaTheme="majorEastAsia"/>
+      <w:i/>
+      <w:iCs/>
+      <w:color w:themeColor="accent1" w:themeShade="BF" w:val="0F4761"/>
+    </w:rPr>
+  </w:style>
+  <w:style w:customStyle="1" w:styleId="Heading5Char" w:type="character">
+    <w:name w:val="Heading 5 Char"/>
+    <w:basedOn w:val="DefaultParagraphFont"/>
+    <w:link w:val="Heading5"/>
+    <w:uiPriority w:val="9"/>
+    <w:semiHidden/>
+    <w:rsid w:val="00A10FD9"/>
+    <w:rPr>
+      <w:rFonts w:cstheme="majorBidi" w:eastAsiaTheme="majorEastAsia"/>
+      <w:color w:themeColor="accent1" w:themeShade="BF" w:val="0F4761"/>
+    </w:rPr>
+  </w:style>
+  <w:style w:customStyle="1" w:styleId="Heading6Char" w:type="character">
+    <w:name w:val="Heading 6 Char"/>
+    <w:basedOn w:val="DefaultParagraphFont"/>
+    <w:link w:val="Heading6"/>
+    <w:uiPriority w:val="9"/>
+    <w:semiHidden/>
+    <w:rsid w:val="00A10FD9"/>
+    <w:rPr>
+      <w:rFonts w:cstheme="majorBidi" w:eastAsiaTheme="majorEastAsia"/>
+      <w:i/>
+      <w:iCs/>
+      <w:color w:themeColor="text1" w:themeTint="A6" w:val="595959"/>
+    </w:rPr>
+  </w:style>
+  <w:style w:customStyle="1" w:styleId="Heading7Char" w:type="character">
+    <w:name w:val="Heading 7 Char"/>
+    <w:basedOn w:val="DefaultParagraphFont"/>
+    <w:link w:val="Heading7"/>
+    <w:uiPriority w:val="9"/>
+    <w:semiHidden/>
+    <w:rsid w:val="00A10FD9"/>
+    <w:rPr>
+      <w:rFonts w:cstheme="majorBidi" w:eastAsiaTheme="majorEastAsia"/>
+      <w:color w:themeColor="text1" w:themeTint="A6" w:val="595959"/>
+    </w:rPr>
+  </w:style>
+  <w:style w:customStyle="1" w:styleId="Heading8Char" w:type="character">
+    <w:name w:val="Heading 8 Char"/>
+    <w:basedOn w:val="DefaultParagraphFont"/>
+    <w:link w:val="Heading8"/>
+    <w:uiPriority w:val="9"/>
+    <w:semiHidden/>
+    <w:rsid w:val="00A10FD9"/>
+    <w:rPr>
+      <w:rFonts w:cstheme="majorBidi" w:eastAsiaTheme="majorEastAsia"/>
+      <w:i/>
+      <w:iCs/>
+      <w:color w:themeColor="text1" w:themeTint="D8" w:val="272727"/>
+    </w:rPr>
+  </w:style>
+  <w:style w:customStyle="1" w:styleId="Heading9Char" w:type="character">
+    <w:name w:val="Heading 9 Char"/>
+    <w:basedOn w:val="DefaultParagraphFont"/>
+    <w:link w:val="Heading9"/>
+    <w:uiPriority w:val="9"/>
+    <w:semiHidden/>
+    <w:rsid w:val="00A10FD9"/>
+    <w:rPr>
+      <w:rFonts w:cstheme="majorBidi" w:eastAsiaTheme="majorEastAsia"/>
+      <w:color w:themeColor="text1" w:themeTint="D8" w:val="272727"/>
     </w:rPr>
   </w:style>
   <w:style w:styleId="BlockText" w:type="paragraph">
@@ -2604,6 +2811,18 @@
     <w:uiPriority w:val="9"/>
     <w:unhideWhenUsed/>
     <w:qFormat/>
+  </w:style>
+  <w:style w:styleId="FootnoteBlockText" w:type="paragraph">
+    <w:name w:val="Footnote Block Text"/>
+    <w:basedOn w:val="FootnoteText"/>
+    <w:next w:val="FootnoteText"/>
+    <w:uiPriority w:val="9"/>
+    <w:unhideWhenUsed/>
+    <w:qFormat/>
+    <w:pPr>
+      <w:spacing w:after="100" w:before="100"/>
+      <w:ind w:firstLine="0" w:left="480" w:right="480"/>
+    </w:pPr>
   </w:style>
   <w:style w:default="1" w:styleId="DefaultParagraphFont" w:type="character">
     <w:name w:val="Default Paragraph Font"/>
@@ -2626,18 +2845,11 @@
       </w:tblCellMar>
     </w:tblPr>
     <w:tblStylePr w:type="firstRow">
-      <w:tblPr>
-        <w:jc w:val="left"/>
-        <w:tblInd w:type="dxa" w:w="0"/>
-      </w:tblPr>
-      <w:trPr>
-        <w:jc w:val="left"/>
-      </w:trPr>
       <w:tcPr>
-        <w:vAlign w:val="bottom"/>
         <w:tcBorders>
           <w:bottom w:val="single"/>
         </w:tcBorders>
+        <w:vAlign w:val="bottom"/>
       </w:tcPr>
     </w:tblStylePr>
   </w:style>
@@ -2752,8 +2964,8 @@
     <w:name w:val="KeywordTok"/>
     <w:basedOn w:val="VerbatimChar"/>
     <w:rPr>
+      <w:b/>
       <w:color w:val="007020"/>
-      <w:b/>
     </w:rPr>
   </w:style>
   <w:style w:type="character" w:customStyle="1" w:styleId="DataTypeTok">
@@ -2830,42 +3042,42 @@
     <w:name w:val="ImportTok"/>
     <w:basedOn w:val="VerbatimChar"/>
     <w:rPr>
+      <w:b/>
       <w:color w:val="008000"/>
-      <w:b/>
     </w:rPr>
   </w:style>
   <w:style w:type="character" w:customStyle="1" w:styleId="CommentTok">
     <w:name w:val="CommentTok"/>
     <w:basedOn w:val="VerbatimChar"/>
     <w:rPr>
+      <w:i/>
       <w:color w:val="60a0b0"/>
-      <w:i/>
     </w:rPr>
   </w:style>
   <w:style w:type="character" w:customStyle="1" w:styleId="DocumentationTok">
     <w:name w:val="DocumentationTok"/>
     <w:basedOn w:val="VerbatimChar"/>
     <w:rPr>
+      <w:i/>
       <w:color w:val="ba2121"/>
-      <w:i/>
     </w:rPr>
   </w:style>
   <w:style w:type="character" w:customStyle="1" w:styleId="AnnotationTok">
     <w:name w:val="AnnotationTok"/>
     <w:basedOn w:val="VerbatimChar"/>
     <w:rPr>
-      <w:color w:val="60a0b0"/>
       <w:b/>
       <w:i/>
+      <w:color w:val="60a0b0"/>
     </w:rPr>
   </w:style>
   <w:style w:type="character" w:customStyle="1" w:styleId="CommentVarTok">
     <w:name w:val="CommentVarTok"/>
     <w:basedOn w:val="VerbatimChar"/>
     <w:rPr>
-      <w:color w:val="60a0b0"/>
       <w:b/>
       <w:i/>
+      <w:color w:val="60a0b0"/>
     </w:rPr>
   </w:style>
   <w:style w:type="character" w:customStyle="1" w:styleId="OtherTok">
@@ -2893,8 +3105,8 @@
     <w:name w:val="ControlFlowTok"/>
     <w:basedOn w:val="VerbatimChar"/>
     <w:rPr>
+      <w:b/>
       <w:color w:val="007020"/>
-      <w:b/>
     </w:rPr>
   </w:style>
   <w:style w:type="character" w:customStyle="1" w:styleId="OperatorTok">
@@ -2939,34 +3151,34 @@
     <w:name w:val="InformationTok"/>
     <w:basedOn w:val="VerbatimChar"/>
     <w:rPr>
-      <w:color w:val="60a0b0"/>
       <w:b/>
       <w:i/>
+      <w:color w:val="60a0b0"/>
     </w:rPr>
   </w:style>
   <w:style w:type="character" w:customStyle="1" w:styleId="WarningTok">
     <w:name w:val="WarningTok"/>
     <w:basedOn w:val="VerbatimChar"/>
     <w:rPr>
-      <w:color w:val="60a0b0"/>
       <w:b/>
       <w:i/>
+      <w:color w:val="60a0b0"/>
     </w:rPr>
   </w:style>
   <w:style w:type="character" w:customStyle="1" w:styleId="AlertTok">
     <w:name w:val="AlertTok"/>
     <w:basedOn w:val="VerbatimChar"/>
     <w:rPr>
+      <w:b/>
       <w:color w:val="ff0000"/>
-      <w:b/>
     </w:rPr>
   </w:style>
   <w:style w:type="character" w:customStyle="1" w:styleId="ErrorTok">
     <w:name w:val="ErrorTok"/>
     <w:basedOn w:val="VerbatimChar"/>
     <w:rPr>
+      <w:b/>
       <w:color w:val="ff0000"/>
-      <w:b/>
     </w:rPr>
   </w:style>
   <w:style w:type="character" w:customStyle="1" w:styleId="NormalTok">
@@ -2988,44 +3200,44 @@
         <a:sysClr val="window" lastClr="FFFFFF"/>
       </a:lt1>
       <a:dk2>
-        <a:srgbClr val="1F497D"/>
+        <a:srgbClr val="0E2841"/>
       </a:dk2>
       <a:lt2>
-        <a:srgbClr val="EEECE1"/>
+        <a:srgbClr val="E8E8E8"/>
       </a:lt2>
       <a:accent1>
-        <a:srgbClr val="4F81BD"/>
+        <a:srgbClr val="156082"/>
       </a:accent1>
       <a:accent2>
-        <a:srgbClr val="C0504D"/>
+        <a:srgbClr val="E97132"/>
       </a:accent2>
       <a:accent3>
-        <a:srgbClr val="9BBB59"/>
+        <a:srgbClr val="196B24"/>
       </a:accent3>
       <a:accent4>
-        <a:srgbClr val="8064A2"/>
+        <a:srgbClr val="0F9ED5"/>
       </a:accent4>
       <a:accent5>
-        <a:srgbClr val="4BACC6"/>
+        <a:srgbClr val="A02B93"/>
       </a:accent5>
       <a:accent6>
-        <a:srgbClr val="F79646"/>
+        <a:srgbClr val="4EA72E"/>
       </a:accent6>
       <a:hlink>
-        <a:srgbClr val="0000FF"/>
+        <a:srgbClr val="467886"/>
       </a:hlink>
       <a:folHlink>
-        <a:srgbClr val="800080"/>
+        <a:srgbClr val="96607D"/>
       </a:folHlink>
     </a:clrScheme>
     <a:fontScheme name="Office">
       <a:majorFont>
-        <a:latin typeface="Calibri"/>
+        <a:latin typeface="Aptos Display" panose="02110004020202020204"/>
         <a:ea typeface=""/>
         <a:cs typeface=""/>
-        <a:font script="Jpan" typeface="ＭＳ ゴシック"/>
+        <a:font script="Jpan" typeface="游ゴシック Light"/>
         <a:font script="Hang" typeface="맑은 고딕"/>
-        <a:font script="Hans" typeface="宋体"/>
+        <a:font script="Hans" typeface="等线 Light"/>
         <a:font script="Hant" typeface="新細明體"/>
         <a:font script="Arab" typeface="Times New Roman"/>
         <a:font script="Hebr" typeface="Times New Roman"/>
@@ -3052,14 +3264,32 @@
         <a:font script="Mong" typeface="Mongolian Baiti"/>
         <a:font script="Viet" typeface="Times New Roman"/>
         <a:font script="Uigh" typeface="Microsoft Uighur"/>
+        <a:font script="Geor" typeface="Sylfaen"/>
+        <a:font script="Armn" typeface="Arial"/>
+        <a:font script="Bugi" typeface="Leelawadee UI"/>
+        <a:font script="Bopo" typeface="Microsoft JhengHei"/>
+        <a:font script="Java" typeface="Javanese Text"/>
+        <a:font script="Lisu" typeface="Segoe UI"/>
+        <a:font script="Mymr" typeface="Myanmar Text"/>
+        <a:font script="Nkoo" typeface="Ebrima"/>
+        <a:font script="Olck" typeface="Nirmala UI"/>
+        <a:font script="Osma" typeface="Ebrima"/>
+        <a:font script="Phag" typeface="Phagspa"/>
+        <a:font script="Syrn" typeface="Estrangelo Edessa"/>
+        <a:font script="Syrj" typeface="Estrangelo Edessa"/>
+        <a:font script="Syre" typeface="Estrangelo Edessa"/>
+        <a:font script="Sora" typeface="Nirmala UI"/>
+        <a:font script="Tale" typeface="Microsoft Tai Le"/>
+        <a:font script="Talu" typeface="Microsoft New Tai Lue"/>
+        <a:font script="Tfng" typeface="Ebrima"/>
       </a:majorFont>
       <a:minorFont>
-        <a:latin typeface="Cambria"/>
+        <a:latin typeface="Aptos" panose="02110004020202020204"/>
         <a:ea typeface=""/>
         <a:cs typeface=""/>
-        <a:font script="Jpan" typeface="ＭＳ 明朝"/>
+        <a:font script="Jpan" typeface="游明朝"/>
         <a:font script="Hang" typeface="맑은 고딕"/>
-        <a:font script="Hans" typeface="宋体"/>
+        <a:font script="Hans" typeface="等线"/>
         <a:font script="Hant" typeface="新細明體"/>
         <a:font script="Arab" typeface="Arial"/>
         <a:font script="Hebr" typeface="Arial"/>
@@ -3086,6 +3316,24 @@
         <a:font script="Mong" typeface="Mongolian Baiti"/>
         <a:font script="Viet" typeface="Arial"/>
         <a:font script="Uigh" typeface="Microsoft Uighur"/>
+        <a:font script="Geor" typeface="Sylfaen"/>
+        <a:font script="Armn" typeface="Arial"/>
+        <a:font script="Bugi" typeface="Leelawadee UI"/>
+        <a:font script="Bopo" typeface="Microsoft JhengHei"/>
+        <a:font script="Java" typeface="Javanese Text"/>
+        <a:font script="Lisu" typeface="Segoe UI"/>
+        <a:font script="Mymr" typeface="Myanmar Text"/>
+        <a:font script="Nkoo" typeface="Ebrima"/>
+        <a:font script="Olck" typeface="Nirmala UI"/>
+        <a:font script="Osma" typeface="Ebrima"/>
+        <a:font script="Phag" typeface="Phagspa"/>
+        <a:font script="Syrn" typeface="Estrangelo Edessa"/>
+        <a:font script="Syrj" typeface="Estrangelo Edessa"/>
+        <a:font script="Syre" typeface="Estrangelo Edessa"/>
+        <a:font script="Sora" typeface="Nirmala UI"/>
+        <a:font script="Tale" typeface="Microsoft Tai Le"/>
+        <a:font script="Talu" typeface="Microsoft New Tai Lue"/>
+        <a:font script="Tfng" typeface="Ebrima"/>
       </a:minorFont>
     </a:fontScheme>
     <a:fmtScheme name="Office">
@@ -3097,200 +3345,141 @@
           <a:gsLst>
             <a:gs pos="0">
               <a:schemeClr val="phClr">
-                <a:tint val="50000"/>
-                <a:satMod val="300000"/>
+                <a:lumMod val="110000"/>
+                <a:satMod val="105000"/>
+                <a:tint val="67000"/>
               </a:schemeClr>
             </a:gs>
-            <a:gs pos="35000">
+            <a:gs pos="50000">
               <a:schemeClr val="phClr">
-                <a:tint val="37000"/>
-                <a:satMod val="300000"/>
+                <a:lumMod val="105000"/>
+                <a:satMod val="103000"/>
+                <a:tint val="73000"/>
               </a:schemeClr>
             </a:gs>
             <a:gs pos="100000">
               <a:schemeClr val="phClr">
-                <a:tint val="15000"/>
-                <a:satMod val="350000"/>
+                <a:lumMod val="105000"/>
+                <a:satMod val="109000"/>
+                <a:tint val="81000"/>
               </a:schemeClr>
             </a:gs>
           </a:gsLst>
-          <a:lin ang="16200000" scaled="1"/>
+          <a:lin ang="5400000" scaled="0"/>
         </a:gradFill>
         <a:gradFill rotWithShape="1">
           <a:gsLst>
             <a:gs pos="0">
               <a:schemeClr val="phClr">
-                <a:tint val="100000"/>
+                <a:satMod val="103000"/>
+                <a:lumMod val="102000"/>
+                <a:tint val="94000"/>
+              </a:schemeClr>
+            </a:gs>
+            <a:gs pos="50000">
+              <a:schemeClr val="phClr">
+                <a:satMod val="110000"/>
+                <a:lumMod val="100000"/>
                 <a:shade val="100000"/>
-                <a:satMod val="130000"/>
               </a:schemeClr>
             </a:gs>
             <a:gs pos="100000">
               <a:schemeClr val="phClr">
-                <a:tint val="50000"/>
-                <a:shade val="100000"/>
-                <a:satMod val="350000"/>
+                <a:lumMod val="99000"/>
+                <a:satMod val="120000"/>
+                <a:shade val="78000"/>
               </a:schemeClr>
             </a:gs>
           </a:gsLst>
-          <a:lin ang="16200000" scaled="0"/>
+          <a:lin ang="5400000" scaled="0"/>
         </a:gradFill>
       </a:fillStyleLst>
       <a:lnStyleLst>
-        <a:ln w="9525" cap="flat" cmpd="sng" algn="ctr">
-          <a:solidFill>
-            <a:schemeClr val="phClr">
-              <a:shade val="95000"/>
-              <a:satMod val="105000"/>
-            </a:schemeClr>
-          </a:solidFill>
-          <a:prstDash val="solid"/>
-        </a:ln>
-        <a:ln w="25400" cap="flat" cmpd="sng" algn="ctr">
+        <a:ln w="6350" cap="flat" cmpd="sng" algn="ctr">
           <a:solidFill>
             <a:schemeClr val="phClr"/>
           </a:solidFill>
           <a:prstDash val="solid"/>
+          <a:miter lim="800000"/>
         </a:ln>
-        <a:ln w="38100" cap="flat" cmpd="sng" algn="ctr">
+        <a:ln w="12700" cap="flat" cmpd="sng" algn="ctr">
           <a:solidFill>
             <a:schemeClr val="phClr"/>
           </a:solidFill>
           <a:prstDash val="solid"/>
+          <a:miter lim="800000"/>
+        </a:ln>
+        <a:ln w="19050" cap="flat" cmpd="sng" algn="ctr">
+          <a:solidFill>
+            <a:schemeClr val="phClr"/>
+          </a:solidFill>
+          <a:prstDash val="solid"/>
+          <a:miter lim="800000"/>
         </a:ln>
       </a:lnStyleLst>
       <a:effectStyleLst>
         <a:effectStyle>
+          <a:effectLst/>
+        </a:effectStyle>
+        <a:effectStyle>
+          <a:effectLst/>
+        </a:effectStyle>
+        <a:effectStyle>
           <a:effectLst>
-            <a:outerShdw blurRad="40000" dist="20000" dir="5400000" rotWithShape="0">
+            <a:outerShdw blurRad="57150" dist="19050" dir="5400000" algn="ctr" rotWithShape="0">
               <a:srgbClr val="000000">
-                <a:alpha val="38000"/>
+                <a:alpha val="63000"/>
               </a:srgbClr>
             </a:outerShdw>
           </a:effectLst>
-        </a:effectStyle>
-        <a:effectStyle>
-          <a:effectLst>
-            <a:outerShdw blurRad="40000" dist="23000" dir="5400000" rotWithShape="0">
-              <a:srgbClr val="000000">
-                <a:alpha val="35000"/>
-              </a:srgbClr>
-            </a:outerShdw>
-          </a:effectLst>
-        </a:effectStyle>
-        <a:effectStyle>
-          <a:effectLst>
-            <a:outerShdw blurRad="40000" dist="23000" dir="5400000" rotWithShape="0">
-              <a:srgbClr val="000000">
-                <a:alpha val="35000"/>
-              </a:srgbClr>
-            </a:outerShdw>
-          </a:effectLst>
-          <a:scene3d>
-            <a:camera prst="orthographicFront">
-              <a:rot lat="0" lon="0" rev="0"/>
-            </a:camera>
-            <a:lightRig rig="threePt" dir="t">
-              <a:rot lat="0" lon="0" rev="1200000"/>
-            </a:lightRig>
-          </a:scene3d>
-          <a:sp3d>
-            <a:bevelT w="63500" h="25400"/>
-          </a:sp3d>
         </a:effectStyle>
       </a:effectStyleLst>
       <a:bgFillStyleLst>
         <a:solidFill>
           <a:schemeClr val="phClr"/>
         </a:solidFill>
+        <a:solidFill>
+          <a:schemeClr val="phClr">
+            <a:tint val="95000"/>
+            <a:satMod val="170000"/>
+          </a:schemeClr>
+        </a:solidFill>
         <a:gradFill rotWithShape="1">
           <a:gsLst>
             <a:gs pos="0">
               <a:schemeClr val="phClr">
-                <a:tint val="40000"/>
-                <a:satMod val="350000"/>
+                <a:tint val="93000"/>
+                <a:satMod val="150000"/>
+                <a:shade val="98000"/>
+                <a:lumMod val="102000"/>
               </a:schemeClr>
             </a:gs>
-            <a:gs pos="40000">
+            <a:gs pos="50000">
               <a:schemeClr val="phClr">
-                <a:tint val="45000"/>
-                <a:shade val="99000"/>
-                <a:satMod val="350000"/>
+                <a:tint val="98000"/>
+                <a:satMod val="130000"/>
+                <a:shade val="90000"/>
+                <a:lumMod val="103000"/>
               </a:schemeClr>
             </a:gs>
             <a:gs pos="100000">
               <a:schemeClr val="phClr">
-                <a:shade val="20000"/>
-                <a:satMod val="255000"/>
+                <a:shade val="63000"/>
+                <a:satMod val="120000"/>
               </a:schemeClr>
             </a:gs>
           </a:gsLst>
-          <a:path path="circle">
-            <a:fillToRect l="50000" t="-80000" r="50000" b="180000"/>
-          </a:path>
-        </a:gradFill>
-        <a:gradFill rotWithShape="1">
-          <a:gsLst>
-            <a:gs pos="0">
-              <a:schemeClr val="phClr">
-                <a:tint val="80000"/>
-                <a:satMod val="300000"/>
-              </a:schemeClr>
-            </a:gs>
-            <a:gs pos="100000">
-              <a:schemeClr val="phClr">
-                <a:shade val="30000"/>
-                <a:satMod val="200000"/>
-              </a:schemeClr>
-            </a:gs>
-          </a:gsLst>
-          <a:path path="circle">
-            <a:fillToRect l="50000" t="50000" r="50000" b="50000"/>
-          </a:path>
+          <a:lin ang="5400000" scaled="0"/>
         </a:gradFill>
       </a:bgFillStyleLst>
     </a:fmtScheme>
   </a:themeElements>
-  <a:objectDefaults>
-    <a:spDef>
-      <a:spPr/>
-      <a:bodyPr/>
-      <a:lstStyle/>
-      <a:style>
-        <a:lnRef idx="1">
-          <a:schemeClr val="accent1"/>
-        </a:lnRef>
-        <a:fillRef idx="3">
-          <a:schemeClr val="accent1"/>
-        </a:fillRef>
-        <a:effectRef idx="2">
-          <a:schemeClr val="accent1"/>
-        </a:effectRef>
-        <a:fontRef idx="minor">
-          <a:schemeClr val="lt1"/>
-        </a:fontRef>
-      </a:style>
-    </a:spDef>
-    <a:lnDef>
-      <a:spPr/>
-      <a:bodyPr/>
-      <a:lstStyle/>
-      <a:style>
-        <a:lnRef idx="2">
-          <a:schemeClr val="accent1"/>
-        </a:lnRef>
-        <a:fillRef idx="0">
-          <a:schemeClr val="accent1"/>
-        </a:fillRef>
-        <a:effectRef idx="1">
-          <a:schemeClr val="accent1"/>
-        </a:effectRef>
-        <a:fontRef idx="minor">
-          <a:schemeClr val="tx1"/>
-        </a:fontRef>
-      </a:style>
-    </a:lnDef>
-  </a:objectDefaults>
+  <a:objectDefaults/>
   <a:extraClrSchemeLst/>
+  <a:extLst>
+    <a:ext uri="{05A4C25C-085E-4340-85A3-A5531E510DB2}">
+      <thm15:themeFamily xmlns:thm15="http://schemas.microsoft.com/office/thememl/2012/main" name="Office Theme" id="{2E142A2C-CD16-42D6-873A-C26D2A0506FA}" vid="{1BDDFF52-6CD6-40A5-AB3C-68EB2F1E4D0A}"/>
+    </a:ext>
+  </a:extLst>
 </a:theme>
 </file>
</xml_diff>